<commit_message>
Added Word export debug logs
Co-authored-by: optenvex2023-beep <267874404+optenvex2023-beep@users.noreply.github.com>
</commit_message>
<xml_diff>
--- a/public/templates/final-report-template.docx
+++ b/public/templates/final-report-template.docx
@@ -1620,7 +1620,7 @@
                 <w:kern w:val="0"/>
                 <w:szCs w:val="20"/>
               </w:rPr>
-              <w:t>{{#IS_TCA_08}}</w:t>
+              <w:t>{{#IS_DGA_X}}</w:t>
             </w:r>
             <w:r>
               <w:rPr>
@@ -1638,7 +1638,7 @@
                 <w:kern w:val="0"/>
                 <w:szCs w:val="20"/>
               </w:rPr>
-              <w:t>{{/IS_TCA_08}}{{^IS_TCA_08}}</w:t>
+              <w:t>{{/IS_DGA_X}}{{^IS_DGA_X}}</w:t>
             </w:r>
             <w:r>
               <w:rPr>
@@ -1656,7 +1656,7 @@
                 <w:kern w:val="0"/>
                 <w:szCs w:val="20"/>
               </w:rPr>
-              <w:t>{{/IS_TCA_08}} TCA-08</w:t>
+              <w:t>{{/IS_DGA_X}} DGA-X</w:t>
             </w:r>
           </w:p>
           <w:p>
@@ -1671,7 +1671,7 @@
                 <w:kern w:val="0"/>
                 <w:szCs w:val="20"/>
               </w:rPr>
-              <w:t>{{#IS_TCA_11}}</w:t>
+              <w:t>{{#IS_DSM_XG}}</w:t>
             </w:r>
             <w:r>
               <w:rPr>
@@ -1689,7 +1689,7 @@
                 <w:kern w:val="0"/>
                 <w:szCs w:val="20"/>
               </w:rPr>
-              <w:t>{{/IS_TCA_11}}{{^IS_TCA_11}}</w:t>
+              <w:t>{{/IS_DSM_XG}}{{^IS_DSM_XG}}</w:t>
             </w:r>
             <w:r>
               <w:rPr>
@@ -1707,7 +1707,7 @@
                 <w:kern w:val="0"/>
                 <w:szCs w:val="20"/>
               </w:rPr>
-              <w:t>{{/IS_TCA_11}} TCA-11</w:t>
+              <w:t>{{/IS_DSM_XG}} DSM-XG</w:t>
             </w:r>
           </w:p>
           <w:p>
@@ -1722,7 +1722,7 @@
                 <w:kern w:val="0"/>
                 <w:szCs w:val="20"/>
               </w:rPr>
-              <w:t>{{#IS_GD_401}}</w:t>
+              <w:t>{{#IS_RGA_60}}</w:t>
             </w:r>
             <w:r>
               <w:rPr>
@@ -1740,7 +1740,7 @@
                 <w:kern w:val="0"/>
                 <w:szCs w:val="20"/>
               </w:rPr>
-              <w:t>{{/IS_GD_401}}{{^IS_GD_401}}</w:t>
+              <w:t>{{/IS_RGA_60}}{{^IS_RGA_60}}</w:t>
             </w:r>
             <w:r>
               <w:rPr>
@@ -1758,7 +1758,7 @@
                 <w:kern w:val="0"/>
                 <w:szCs w:val="20"/>
               </w:rPr>
-              <w:t>{{/IS_GD_401}} GD-401</w:t>
+              <w:t>{{/IS_RGA_60}} RGA-60</w:t>
             </w:r>
           </w:p>
           <w:p>
@@ -1773,7 +1773,7 @@
                 <w:kern w:val="0"/>
                 <w:szCs w:val="20"/>
               </w:rPr>
-              <w:t>{{#IS_DCS_2N}}</w:t>
+              <w:t>{{#IS_RSM_61}}</w:t>
             </w:r>
             <w:r>
               <w:rPr>
@@ -1791,7 +1791,7 @@
                 <w:kern w:val="0"/>
                 <w:szCs w:val="20"/>
               </w:rPr>
-              <w:t>{{/IS_DCS_2N}}{{^IS_DCS_2N}}</w:t>
+              <w:t>{{/IS_RSM_61}}{{^IS_RSM_61}}</w:t>
             </w:r>
             <w:r>
               <w:rPr>
@@ -1809,7 +1809,262 @@
                 <w:kern w:val="0"/>
                 <w:szCs w:val="20"/>
               </w:rPr>
-              <w:t>{{/IS_DCS_2N}} DCS-2N</w:t>
+              <w:t>{{/IS_RSM_61}} RSM-61</w:t>
+            </w:r>
+          </w:p>
+          <w:p>
+            <w:pPr>
+              <w:jc w:val="left"/>
+              <w:textAlignment w:val="baseline"/>
+            </w:pPr>
+            <w:r>
+              <w:rPr>
+                <w:rFonts w:eastAsiaTheme="minorHAnsi" w:cs="굴림"/>
+                <w:color w:val="404040" w:themeColor="text1" w:themeTint="BF"/>
+                <w:kern w:val="0"/>
+                <w:szCs w:val="20"/>
+              </w:rPr>
+              <w:t>{{#IS_TGA_50}}</w:t>
+            </w:r>
+            <w:r>
+              <w:rPr>
+                <w:rFonts w:ascii="Segoe UI Symbol" w:eastAsiaTheme="minorHAnsi" w:hAnsi="Segoe UI Symbol" w:cs="Segoe UI Symbol"/>
+                <w:color w:val="404040" w:themeColor="text1" w:themeTint="BF"/>
+                <w:kern w:val="0"/>
+                <w:szCs w:val="20"/>
+              </w:rPr>
+              <w:t>☑</w:t>
+            </w:r>
+            <w:r>
+              <w:rPr>
+                <w:rFonts w:eastAsiaTheme="minorHAnsi" w:cs="굴림"/>
+                <w:color w:val="404040" w:themeColor="text1" w:themeTint="BF"/>
+                <w:kern w:val="0"/>
+                <w:szCs w:val="20"/>
+              </w:rPr>
+              <w:t>{{/IS_TGA_50}}{{^IS_TGA_50}}</w:t>
+            </w:r>
+            <w:r>
+              <w:rPr>
+                <w:rFonts w:ascii="Segoe UI Symbol" w:eastAsiaTheme="minorHAnsi" w:hAnsi="Segoe UI Symbol" w:cs="Segoe UI Symbol"/>
+                <w:color w:val="404040" w:themeColor="text1" w:themeTint="BF"/>
+                <w:kern w:val="0"/>
+                <w:szCs w:val="20"/>
+              </w:rPr>
+              <w:t>☐</w:t>
+            </w:r>
+            <w:r>
+              <w:rPr>
+                <w:rFonts w:eastAsiaTheme="minorHAnsi" w:cs="굴림"/>
+                <w:color w:val="404040" w:themeColor="text1" w:themeTint="BF"/>
+                <w:kern w:val="0"/>
+                <w:szCs w:val="20"/>
+              </w:rPr>
+              <w:t>{{/IS_TGA_50}} TGA-50</w:t>
+            </w:r>
+          </w:p>
+          <w:p>
+            <w:pPr>
+              <w:jc w:val="left"/>
+              <w:textAlignment w:val="baseline"/>
+            </w:pPr>
+            <w:r>
+              <w:rPr>
+                <w:rFonts w:eastAsiaTheme="minorHAnsi" w:cs="굴림"/>
+                <w:color w:val="404040" w:themeColor="text1" w:themeTint="BF"/>
+                <w:kern w:val="0"/>
+                <w:szCs w:val="20"/>
+              </w:rPr>
+              <w:t>{{#IS_LSM_30}}</w:t>
+            </w:r>
+            <w:r>
+              <w:rPr>
+                <w:rFonts w:ascii="Segoe UI Symbol" w:eastAsiaTheme="minorHAnsi" w:hAnsi="Segoe UI Symbol" w:cs="Segoe UI Symbol"/>
+                <w:color w:val="404040" w:themeColor="text1" w:themeTint="BF"/>
+                <w:kern w:val="0"/>
+                <w:szCs w:val="20"/>
+              </w:rPr>
+              <w:t>☑</w:t>
+            </w:r>
+            <w:r>
+              <w:rPr>
+                <w:rFonts w:eastAsiaTheme="minorHAnsi" w:cs="굴림"/>
+                <w:color w:val="404040" w:themeColor="text1" w:themeTint="BF"/>
+                <w:kern w:val="0"/>
+                <w:szCs w:val="20"/>
+              </w:rPr>
+              <w:t>{{/IS_LSM_30}}{{^IS_LSM_30}}</w:t>
+            </w:r>
+            <w:r>
+              <w:rPr>
+                <w:rFonts w:ascii="Segoe UI Symbol" w:eastAsiaTheme="minorHAnsi" w:hAnsi="Segoe UI Symbol" w:cs="Segoe UI Symbol"/>
+                <w:color w:val="404040" w:themeColor="text1" w:themeTint="BF"/>
+                <w:kern w:val="0"/>
+                <w:szCs w:val="20"/>
+              </w:rPr>
+              <w:t>☐</w:t>
+            </w:r>
+            <w:r>
+              <w:rPr>
+                <w:rFonts w:eastAsiaTheme="minorHAnsi" w:cs="굴림"/>
+                <w:color w:val="404040" w:themeColor="text1" w:themeTint="BF"/>
+                <w:kern w:val="0"/>
+                <w:szCs w:val="20"/>
+              </w:rPr>
+              <w:t>{{/IS_LSM_30}} LSM-30</w:t>
+            </w:r>
+          </w:p>
+          <w:p>
+            <w:pPr>
+              <w:jc w:val="left"/>
+              <w:textAlignment w:val="baseline"/>
+            </w:pPr>
+            <w:r>
+              <w:rPr>
+                <w:rFonts w:eastAsiaTheme="minorHAnsi" w:cs="굴림"/>
+                <w:color w:val="404040" w:themeColor="text1" w:themeTint="BF"/>
+                <w:kern w:val="0"/>
+                <w:szCs w:val="20"/>
+              </w:rPr>
+              <w:t>{{#IS_GGA_70_1}}</w:t>
+            </w:r>
+            <w:r>
+              <w:rPr>
+                <w:rFonts w:ascii="Segoe UI Symbol" w:eastAsiaTheme="minorHAnsi" w:hAnsi="Segoe UI Symbol" w:cs="Segoe UI Symbol"/>
+                <w:color w:val="404040" w:themeColor="text1" w:themeTint="BF"/>
+                <w:kern w:val="0"/>
+                <w:szCs w:val="20"/>
+              </w:rPr>
+              <w:t>☑</w:t>
+            </w:r>
+            <w:r>
+              <w:rPr>
+                <w:rFonts w:eastAsiaTheme="minorHAnsi" w:cs="굴림"/>
+                <w:color w:val="404040" w:themeColor="text1" w:themeTint="BF"/>
+                <w:kern w:val="0"/>
+                <w:szCs w:val="20"/>
+              </w:rPr>
+              <w:t>{{/IS_GGA_70_1}}{{^IS_GGA_70_1}}</w:t>
+            </w:r>
+            <w:r>
+              <w:rPr>
+                <w:rFonts w:ascii="Segoe UI Symbol" w:eastAsiaTheme="minorHAnsi" w:hAnsi="Segoe UI Symbol" w:cs="Segoe UI Symbol"/>
+                <w:color w:val="404040" w:themeColor="text1" w:themeTint="BF"/>
+                <w:kern w:val="0"/>
+                <w:szCs w:val="20"/>
+              </w:rPr>
+              <w:t>☐</w:t>
+            </w:r>
+            <w:r>
+              <w:rPr>
+                <w:rFonts w:eastAsiaTheme="minorHAnsi" w:cs="굴림"/>
+                <w:color w:val="404040" w:themeColor="text1" w:themeTint="BF"/>
+                <w:kern w:val="0"/>
+                <w:szCs w:val="20"/>
+              </w:rPr>
+              <w:t>{{/IS_GGA_70_1}} GGA-70-1</w:t>
+            </w:r>
+          </w:p>
+          <w:p>
+            <w:pPr>
+              <w:jc w:val="left"/>
+              <w:textAlignment w:val="baseline"/>
+            </w:pPr>
+            <w:r>
+              <w:rPr>
+                <w:rFonts w:eastAsiaTheme="minorHAnsi" w:cs="굴림"/>
+                <w:color w:val="404040" w:themeColor="text1" w:themeTint="BF"/>
+                <w:kern w:val="0"/>
+                <w:szCs w:val="20"/>
+              </w:rPr>
+              <w:t>{{#IS_PGA_91}}</w:t>
+            </w:r>
+            <w:r>
+              <w:rPr>
+                <w:rFonts w:ascii="Segoe UI Symbol" w:eastAsiaTheme="minorHAnsi" w:hAnsi="Segoe UI Symbol" w:cs="Segoe UI Symbol"/>
+                <w:color w:val="404040" w:themeColor="text1" w:themeTint="BF"/>
+                <w:kern w:val="0"/>
+                <w:szCs w:val="20"/>
+              </w:rPr>
+              <w:t>☑</w:t>
+            </w:r>
+            <w:r>
+              <w:rPr>
+                <w:rFonts w:eastAsiaTheme="minorHAnsi" w:cs="굴림"/>
+                <w:color w:val="404040" w:themeColor="text1" w:themeTint="BF"/>
+                <w:kern w:val="0"/>
+                <w:szCs w:val="20"/>
+              </w:rPr>
+              <w:t>{{/IS_PGA_91}}{{^IS_PGA_91}}</w:t>
+            </w:r>
+            <w:r>
+              <w:rPr>
+                <w:rFonts w:ascii="Segoe UI Symbol" w:eastAsiaTheme="minorHAnsi" w:hAnsi="Segoe UI Symbol" w:cs="Segoe UI Symbol"/>
+                <w:color w:val="404040" w:themeColor="text1" w:themeTint="BF"/>
+                <w:kern w:val="0"/>
+                <w:szCs w:val="20"/>
+              </w:rPr>
+              <w:t>☐</w:t>
+            </w:r>
+            <w:r>
+              <w:rPr>
+                <w:rFonts w:eastAsiaTheme="minorHAnsi" w:cs="굴림"/>
+                <w:color w:val="404040" w:themeColor="text1" w:themeTint="BF"/>
+                <w:kern w:val="0"/>
+                <w:szCs w:val="20"/>
+              </w:rPr>
+              <w:t>{{/IS_PGA_91}} PGA-91</w:t>
+            </w:r>
+          </w:p>
+          <w:p>
+            <w:pPr>
+              <w:jc w:val="left"/>
+              <w:textAlignment w:val="baseline"/>
+            </w:pPr>
+            <w:r>
+              <w:rPr>
+                <w:rFonts w:eastAsiaTheme="minorHAnsi" w:cs="굴림"/>
+                <w:color w:val="404040" w:themeColor="text1" w:themeTint="BF"/>
+                <w:kern w:val="0"/>
+                <w:szCs w:val="20"/>
+              </w:rPr>
+              <w:t>{{#IS_OTHER_MODEL}}</w:t>
+            </w:r>
+            <w:r>
+              <w:rPr>
+                <w:rFonts w:ascii="Segoe UI Symbol" w:eastAsiaTheme="minorHAnsi" w:hAnsi="Segoe UI Symbol" w:cs="Segoe UI Symbol"/>
+                <w:color w:val="404040" w:themeColor="text1" w:themeTint="BF"/>
+                <w:kern w:val="0"/>
+                <w:szCs w:val="20"/>
+              </w:rPr>
+              <w:t>☑</w:t>
+            </w:r>
+            <w:r>
+              <w:rPr>
+                <w:rFonts w:eastAsiaTheme="minorHAnsi" w:cs="굴림"/>
+                <w:color w:val="404040" w:themeColor="text1" w:themeTint="BF"/>
+                <w:kern w:val="0"/>
+                <w:szCs w:val="20"/>
+              </w:rPr>
+              <w:t>{{/IS_OTHER_MODEL}}{{^IS_OTHER_MODEL}}</w:t>
+            </w:r>
+            <w:r>
+              <w:rPr>
+                <w:rFonts w:ascii="Segoe UI Symbol" w:eastAsiaTheme="minorHAnsi" w:hAnsi="Segoe UI Symbol" w:cs="Segoe UI Symbol"/>
+                <w:color w:val="404040" w:themeColor="text1" w:themeTint="BF"/>
+                <w:kern w:val="0"/>
+                <w:szCs w:val="20"/>
+              </w:rPr>
+              <w:t>☐</w:t>
+            </w:r>
+            <w:r>
+              <w:rPr>
+                <w:rFonts w:eastAsiaTheme="minorHAnsi" w:cs="굴림"/>
+                <w:color w:val="404040" w:themeColor="text1" w:themeTint="BF"/>
+                <w:kern w:val="0"/>
+                <w:szCs w:val="20"/>
+              </w:rPr>
+              <w:t>{{/IS_OTHER_MODEL}} 기타 ({{OTHER_MODEL_NAME}})</w:t>
             </w:r>
           </w:p>
         </w:tc>

</xml_diff>

<commit_message>
Adjusted signature table spacing
Co-authored-by: optenvex2023-beep <267874404+optenvex2023-beep@users.noreply.github.com>
</commit_message>
<xml_diff>
--- a/public/templates/final-report-template.docx
+++ b/public/templates/final-report-template.docx
@@ -10,7 +10,7 @@
         <w:rPr>
           <w:rFonts w:asciiTheme="minorHAnsi" w:eastAsiaTheme="minorHAnsi" w:hAnsiTheme="minorHAnsi"/>
           <w:b/>
-          <w:sz w:val="12"/>
+          <w:sz w:val="2"/>
           <w:szCs w:val="24"/>
         </w:rPr>
       </w:pPr>
@@ -23,7 +23,7 @@
         <w:rPr>
           <w:rFonts w:asciiTheme="minorHAnsi" w:eastAsiaTheme="minorHAnsi" w:hAnsiTheme="minorHAnsi"/>
           <w:b/>
-          <w:sz w:val="12"/>
+          <w:sz w:val="2"/>
           <w:szCs w:val="24"/>
         </w:rPr>
       </w:pPr>
@@ -36,7 +36,7 @@
         <w:rPr>
           <w:rFonts w:asciiTheme="minorHAnsi" w:eastAsiaTheme="minorHAnsi" w:hAnsiTheme="minorHAnsi"/>
           <w:b/>
-          <w:sz w:val="12"/>
+          <w:sz w:val="2"/>
           <w:szCs w:val="24"/>
         </w:rPr>
       </w:pPr>
@@ -49,7 +49,7 @@
         <w:rPr>
           <w:rFonts w:asciiTheme="minorHAnsi" w:eastAsiaTheme="minorHAnsi" w:hAnsiTheme="minorHAnsi"/>
           <w:b/>
-          <w:sz w:val="12"/>
+          <w:sz w:val="2"/>
           <w:szCs w:val="24"/>
         </w:rPr>
       </w:pPr>
@@ -62,7 +62,7 @@
         <w:rPr>
           <w:rFonts w:asciiTheme="minorHAnsi" w:eastAsiaTheme="minorHAnsi" w:hAnsiTheme="minorHAnsi"/>
           <w:b/>
-          <w:sz w:val="12"/>
+          <w:sz w:val="2"/>
           <w:szCs w:val="24"/>
         </w:rPr>
       </w:pPr>
@@ -75,7 +75,7 @@
         <w:rPr>
           <w:rFonts w:asciiTheme="minorHAnsi" w:eastAsiaTheme="minorHAnsi" w:hAnsiTheme="minorHAnsi"/>
           <w:b/>
-          <w:sz w:val="12"/>
+          <w:sz w:val="2"/>
           <w:szCs w:val="24"/>
         </w:rPr>
       </w:pPr>
@@ -88,7 +88,7 @@
         <w:rPr>
           <w:rFonts w:asciiTheme="minorHAnsi" w:eastAsiaTheme="minorHAnsi" w:hAnsiTheme="minorHAnsi"/>
           <w:b/>
-          <w:sz w:val="12"/>
+          <w:sz w:val="2"/>
           <w:szCs w:val="24"/>
         </w:rPr>
       </w:pPr>
@@ -101,7 +101,7 @@
         <w:rPr>
           <w:rFonts w:asciiTheme="minorHAnsi" w:eastAsiaTheme="minorHAnsi" w:hAnsiTheme="minorHAnsi"/>
           <w:b/>
-          <w:sz w:val="12"/>
+          <w:sz w:val="2"/>
           <w:szCs w:val="24"/>
         </w:rPr>
       </w:pPr>
@@ -114,7 +114,7 @@
         <w:rPr>
           <w:rFonts w:asciiTheme="minorHAnsi" w:eastAsiaTheme="minorHAnsi" w:hAnsiTheme="minorHAnsi"/>
           <w:b/>
-          <w:sz w:val="12"/>
+          <w:sz w:val="2"/>
           <w:szCs w:val="24"/>
         </w:rPr>
       </w:pPr>
@@ -127,7 +127,7 @@
         <w:rPr>
           <w:rFonts w:asciiTheme="minorHAnsi" w:eastAsiaTheme="minorHAnsi" w:hAnsiTheme="minorHAnsi"/>
           <w:b/>
-          <w:sz w:val="12"/>
+          <w:sz w:val="2"/>
           <w:szCs w:val="24"/>
         </w:rPr>
       </w:pPr>
@@ -140,7 +140,7 @@
         <w:rPr>
           <w:rFonts w:asciiTheme="minorHAnsi" w:eastAsiaTheme="minorHAnsi" w:hAnsiTheme="minorHAnsi"/>
           <w:b/>
-          <w:sz w:val="12"/>
+          <w:sz w:val="2"/>
           <w:szCs w:val="24"/>
         </w:rPr>
       </w:pPr>
@@ -149,7 +149,7 @@
           <w:rFonts w:asciiTheme="minorHAnsi" w:eastAsiaTheme="minorHAnsi" w:hAnsiTheme="minorHAnsi" w:hint="eastAsia"/>
           <w:b/>
           <w:noProof/>
-          <w:sz w:val="12"/>
+          <w:sz w:val="2"/>
           <w:szCs w:val="24"/>
         </w:rPr>
         <w:drawing>
@@ -219,7 +219,7 @@
         <w:rPr>
           <w:rFonts w:asciiTheme="minorHAnsi" w:eastAsiaTheme="minorHAnsi" w:hAnsiTheme="minorHAnsi"/>
           <w:b/>
-          <w:sz w:val="12"/>
+          <w:sz w:val="2"/>
           <w:szCs w:val="24"/>
         </w:rPr>
         <w:br/>
@@ -228,7 +228,7 @@
         <w:rPr>
           <w:rFonts w:asciiTheme="minorHAnsi" w:eastAsiaTheme="minorHAnsi" w:hAnsiTheme="minorHAnsi"/>
           <w:b/>
-          <w:sz w:val="12"/>
+          <w:sz w:val="2"/>
           <w:szCs w:val="24"/>
         </w:rPr>
         <w:br/>
@@ -241,7 +241,7 @@
         <w:rPr>
           <w:rFonts w:asciiTheme="minorHAnsi" w:eastAsiaTheme="minorHAnsi" w:hAnsiTheme="minorHAnsi"/>
           <w:b/>
-          <w:sz w:val="12"/>
+          <w:sz w:val="2"/>
           <w:szCs w:val="24"/>
         </w:rPr>
       </w:pPr>
@@ -554,7 +554,7 @@
         <w:rPr>
           <w:rFonts w:asciiTheme="minorHAnsi" w:eastAsiaTheme="minorHAnsi" w:hAnsiTheme="minorHAnsi"/>
           <w:b/>
-          <w:sz w:val="12"/>
+          <w:sz w:val="2"/>
           <w:szCs w:val="24"/>
         </w:rPr>
       </w:pPr>
@@ -585,7 +585,7 @@
       </w:tblGrid>
       <w:tr>
         <w:trPr>
-          <w:trHeight w:val="245"/>
+          <w:trHeight w:val="200" w:hRule="atLeast"/>
         </w:trPr>
         <w:tc>
           <w:tcPr>
@@ -782,7 +782,7 @@
       </w:tr>
       <w:tr>
         <w:trPr>
-          <w:trHeight w:val="837"/>
+          <w:trHeight w:val="300" w:hRule="atLeast"/>
         </w:trPr>
         <w:tc>
           <w:tcPr>
@@ -949,7 +949,7 @@
         <w:rPr>
           <w:rFonts w:asciiTheme="minorHAnsi" w:eastAsiaTheme="minorHAnsi" w:hAnsiTheme="minorHAnsi"/>
           <w:b/>
-          <w:sz w:val="12"/>
+          <w:sz w:val="2"/>
           <w:szCs w:val="24"/>
         </w:rPr>
       </w:pPr>
@@ -961,7 +961,7 @@
         <w:rPr>
           <w:rFonts w:asciiTheme="minorHAnsi" w:eastAsiaTheme="minorHAnsi" w:hAnsiTheme="minorHAnsi"/>
           <w:b/>
-          <w:sz w:val="12"/>
+          <w:sz w:val="2"/>
           <w:szCs w:val="24"/>
         </w:rPr>
       </w:pPr>
@@ -969,7 +969,7 @@
     <w:tbl>
       <w:tblPr>
         <w:tblStyle w:val="a7"/>
-        <w:tblpPr w:leftFromText="142" w:rightFromText="142" w:vertAnchor="text" w:horzAnchor="margin" w:tblpXSpec="center" w:tblpY="864"/>
+        <w:tblpPr w:leftFromText="142" w:rightFromText="142" w:vertAnchor="text" w:horzAnchor="margin" w:tblpXSpec="center" w:tblpY="100"/>
         <w:tblW w:w="0" w:type="auto"/>
         <w:tblLook w:val="04A0" w:firstRow="1" w:lastRow="0" w:firstColumn="1" w:lastColumn="0" w:noHBand="0" w:noVBand="1"/>
       </w:tblPr>
@@ -994,7 +994,7 @@
               <w:rPr>
                 <w:rFonts w:asciiTheme="minorHAnsi" w:eastAsiaTheme="minorHAnsi" w:hAnsiTheme="minorHAnsi"/>
                 <w:b/>
-                <w:sz w:val="12"/>
+                <w:sz w:val="2"/>
                 <w:szCs w:val="24"/>
               </w:rPr>
             </w:pPr>
@@ -1276,7 +1276,7 @@
         <w:rPr>
           <w:rFonts w:asciiTheme="minorHAnsi" w:eastAsiaTheme="minorHAnsi" w:hAnsiTheme="minorHAnsi"/>
           <w:b/>
-          <w:sz w:val="12"/>
+          <w:sz w:val="2"/>
           <w:szCs w:val="24"/>
         </w:rPr>
       </w:pPr>
@@ -1288,7 +1288,7 @@
         <w:rPr>
           <w:rFonts w:asciiTheme="minorHAnsi" w:eastAsiaTheme="minorHAnsi" w:hAnsiTheme="minorHAnsi"/>
           <w:b/>
-          <w:sz w:val="12"/>
+          <w:sz w:val="2"/>
           <w:szCs w:val="24"/>
         </w:rPr>
       </w:pPr>
@@ -1300,7 +1300,7 @@
         <w:rPr>
           <w:rFonts w:asciiTheme="minorHAnsi" w:eastAsiaTheme="minorHAnsi" w:hAnsiTheme="minorHAnsi"/>
           <w:b/>
-          <w:sz w:val="12"/>
+          <w:sz w:val="2"/>
           <w:szCs w:val="24"/>
         </w:rPr>
       </w:pPr>
@@ -1312,7 +1312,7 @@
         <w:rPr>
           <w:rFonts w:asciiTheme="minorHAnsi" w:eastAsiaTheme="minorHAnsi" w:hAnsiTheme="minorHAnsi"/>
           <w:b/>
-          <w:sz w:val="12"/>
+          <w:sz w:val="2"/>
           <w:szCs w:val="24"/>
         </w:rPr>
       </w:pPr>
@@ -1324,7 +1324,7 @@
         <w:rPr>
           <w:rFonts w:asciiTheme="minorHAnsi" w:eastAsiaTheme="minorHAnsi" w:hAnsiTheme="minorHAnsi"/>
           <w:b/>
-          <w:sz w:val="12"/>
+          <w:sz w:val="2"/>
           <w:szCs w:val="24"/>
         </w:rPr>
       </w:pPr>
@@ -1336,7 +1336,7 @@
         <w:rPr>
           <w:rFonts w:asciiTheme="minorHAnsi" w:eastAsiaTheme="minorHAnsi" w:hAnsiTheme="minorHAnsi"/>
           <w:b/>
-          <w:sz w:val="12"/>
+          <w:sz w:val="2"/>
           <w:szCs w:val="24"/>
         </w:rPr>
       </w:pPr>
@@ -1348,7 +1348,7 @@
         <w:rPr>
           <w:rFonts w:asciiTheme="minorHAnsi" w:eastAsiaTheme="minorHAnsi" w:hAnsiTheme="minorHAnsi"/>
           <w:b/>
-          <w:sz w:val="12"/>
+          <w:sz w:val="2"/>
           <w:szCs w:val="24"/>
         </w:rPr>
       </w:pPr>
@@ -1360,7 +1360,7 @@
         <w:rPr>
           <w:rFonts w:asciiTheme="minorHAnsi" w:eastAsiaTheme="minorHAnsi" w:hAnsiTheme="minorHAnsi"/>
           <w:b/>
-          <w:sz w:val="12"/>
+          <w:sz w:val="2"/>
           <w:szCs w:val="24"/>
         </w:rPr>
       </w:pPr>
@@ -1372,7 +1372,7 @@
         <w:rPr>
           <w:rFonts w:asciiTheme="minorHAnsi" w:eastAsiaTheme="minorHAnsi" w:hAnsiTheme="minorHAnsi"/>
           <w:b/>
-          <w:sz w:val="12"/>
+          <w:sz w:val="2"/>
           <w:szCs w:val="24"/>
         </w:rPr>
       </w:pPr>
@@ -1384,7 +1384,7 @@
         <w:rPr>
           <w:rFonts w:asciiTheme="minorHAnsi" w:eastAsiaTheme="minorHAnsi" w:hAnsiTheme="minorHAnsi"/>
           <w:b/>
-          <w:sz w:val="12"/>
+          <w:sz w:val="2"/>
           <w:szCs w:val="24"/>
         </w:rPr>
       </w:pPr>
@@ -1396,7 +1396,7 @@
         <w:rPr>
           <w:rFonts w:asciiTheme="minorHAnsi" w:eastAsiaTheme="minorHAnsi" w:hAnsiTheme="minorHAnsi"/>
           <w:b/>
-          <w:sz w:val="12"/>
+          <w:sz w:val="2"/>
           <w:szCs w:val="24"/>
         </w:rPr>
       </w:pPr>

</xml_diff>

<commit_message>
Forced page break before table
Co-authored-by: optenvex2023-beep <267874404+optenvex2023-beep@users.noreply.github.com>
</commit_message>
<xml_diff>
--- a/public/templates/final-report-template.docx
+++ b/public/templates/final-report-template.docx
@@ -223,14 +223,6 @@
           <w:szCs w:val="24"/>
         </w:rPr>
         <w:br/>
-      </w:r>
-      <w:r>
-        <w:rPr>
-          <w:rFonts w:asciiTheme="minorHAnsi" w:eastAsiaTheme="minorHAnsi" w:hAnsiTheme="minorHAnsi"/>
-          <w:b/>
-          <w:sz w:val="2"/>
-          <w:szCs w:val="24"/>
-        </w:rPr>
         <w:br/>
       </w:r>
     </w:p>
@@ -286,57 +278,7 @@
           <w:sz w:val="36"/>
           <w:szCs w:val="24"/>
         </w:rPr>
-        <w:t>[</w:t>
-      </w:r>
-      <w:r>
-        <w:rPr>
-          <w:rFonts w:eastAsiaTheme="minorHAnsi" w:hint="eastAsia"/>
-          <w:b/>
-          <w:color w:val="262626" w:themeColor="text1" w:themeTint="D9"/>
-          <w:sz w:val="36"/>
-          <w:szCs w:val="24"/>
-        </w:rPr>
-        <w:t>완료</w:t>
-      </w:r>
-      <w:r>
-        <w:rPr>
-          <w:rFonts w:eastAsiaTheme="minorHAnsi" w:hint="eastAsia"/>
-          <w:b/>
-          <w:color w:val="262626" w:themeColor="text1" w:themeTint="D9"/>
-          <w:sz w:val="36"/>
-          <w:szCs w:val="24"/>
-        </w:rPr>
-        <w:t xml:space="preserve"> 점검</w:t>
-      </w:r>
-      <w:r>
-        <w:rPr>
-          <w:rFonts w:eastAsiaTheme="minorHAnsi" w:hint="eastAsia"/>
-          <w:b/>
-          <w:color w:val="262626" w:themeColor="text1" w:themeTint="D9"/>
-          <w:sz w:val="36"/>
-          <w:szCs w:val="24"/>
-        </w:rPr>
-        <w:t xml:space="preserve"> </w:t>
-      </w:r>
-      <w:r>
-        <w:rPr>
-          <w:rFonts w:eastAsiaTheme="minorHAnsi" w:hint="eastAsia"/>
-          <w:b/>
-          <w:color w:val="262626" w:themeColor="text1" w:themeTint="D9"/>
-          <w:sz w:val="36"/>
-          <w:szCs w:val="24"/>
-        </w:rPr>
-        <w:t>보고서</w:t>
-      </w:r>
-      <w:r>
-        <w:rPr>
-          <w:rFonts w:eastAsiaTheme="minorHAnsi" w:hint="eastAsia"/>
-          <w:b/>
-          <w:color w:val="262626" w:themeColor="text1" w:themeTint="D9"/>
-          <w:sz w:val="36"/>
-          <w:szCs w:val="24"/>
-        </w:rPr>
-        <w:t>]</w:t>
+        <w:t>[완료 점검 보고서]</w:t>
       </w:r>
       <w:r>
         <w:rPr>
@@ -359,22 +301,13 @@
           <w:szCs w:val="24"/>
         </w:rPr>
       </w:pPr>
-      <w:proofErr w:type="gramStart"/>
       <w:r>
         <w:rPr>
           <w:rFonts w:eastAsiaTheme="minorHAnsi" w:hint="eastAsia"/>
           <w:color w:val="262626" w:themeColor="text1" w:themeTint="D9"/>
           <w:sz w:val="28"/>
         </w:rPr>
-        <w:t>□</w:t>
-      </w:r>
-      <w:r>
-        <w:rPr>
-          <w:rFonts w:eastAsiaTheme="minorHAnsi" w:hint="eastAsia"/>
-          <w:color w:val="262626" w:themeColor="text1" w:themeTint="D9"/>
-          <w:sz w:val="28"/>
-        </w:rPr>
-        <w:t xml:space="preserve">  </w:t>
+        <w:t xml:space="preserve">□  </w:t>
       </w:r>
       <w:r>
         <w:rPr>
@@ -385,7 +318,6 @@
         </w:rPr>
         <w:t>입고</w:t>
       </w:r>
-      <w:proofErr w:type="gramEnd"/>
       <w:r>
         <w:rPr>
           <w:rFonts w:eastAsiaTheme="minorHAnsi" w:hint="eastAsia"/>
@@ -408,15 +340,7 @@
           <w:color w:val="262626" w:themeColor="text1" w:themeTint="D9"/>
           <w:sz w:val="28"/>
         </w:rPr>
-        <w:t>□</w:t>
-      </w:r>
-      <w:r>
-        <w:rPr>
-          <w:rFonts w:eastAsiaTheme="minorHAnsi" w:hint="eastAsia"/>
-          <w:color w:val="262626" w:themeColor="text1" w:themeTint="D9"/>
-          <w:sz w:val="28"/>
-        </w:rPr>
-        <w:t xml:space="preserve"> </w:t>
+        <w:t xml:space="preserve">□ </w:t>
       </w:r>
       <w:r>
         <w:rPr>
@@ -441,15 +365,7 @@
           <w:color w:val="262626" w:themeColor="text1" w:themeTint="D9"/>
           <w:sz w:val="28"/>
         </w:rPr>
-        <w:t xml:space="preserve"> </w:t>
-      </w:r>
-      <w:r>
-        <w:rPr>
-          <w:rFonts w:eastAsiaTheme="minorHAnsi"/>
-          <w:color w:val="262626" w:themeColor="text1" w:themeTint="D9"/>
-          <w:sz w:val="28"/>
-        </w:rPr>
-        <w:t xml:space="preserve"> </w:t>
+        <w:t xml:space="preserve">  </w:t>
       </w:r>
       <w:r>
         <w:rPr>
@@ -467,15 +383,7 @@
           <w:color w:val="262626" w:themeColor="text1" w:themeTint="D9"/>
           <w:sz w:val="28"/>
         </w:rPr>
-        <w:t xml:space="preserve"> </w:t>
-      </w:r>
-      <w:r>
-        <w:rPr>
-          <w:rFonts w:eastAsiaTheme="minorHAnsi" w:hint="eastAsia"/>
-          <w:color w:val="262626" w:themeColor="text1" w:themeTint="D9"/>
-          <w:sz w:val="28"/>
-        </w:rPr>
-        <w:t xml:space="preserve"> </w:t>
+        <w:t xml:space="preserve">  </w:t>
       </w:r>
       <w:r>
         <w:rPr>
@@ -619,7 +527,6 @@
                 <w:szCs w:val="20"/>
               </w:rPr>
             </w:pPr>
-            <w:proofErr w:type="spellStart"/>
             <w:r>
               <w:rPr>
                 <w:rFonts w:eastAsiaTheme="minorHAnsi" w:cs="굴림"/>
@@ -630,7 +537,6 @@
               </w:rPr>
               <w:t>점검자</w:t>
             </w:r>
-            <w:proofErr w:type="spellEnd"/>
           </w:p>
         </w:tc>
         <w:tc>
@@ -709,7 +615,6 @@
                 <w:szCs w:val="20"/>
               </w:rPr>
             </w:pPr>
-            <w:proofErr w:type="spellStart"/>
             <w:r>
               <w:rPr>
                 <w:rFonts w:eastAsiaTheme="minorHAnsi" w:cs="굴림"/>
@@ -728,18 +633,7 @@
                 <w:kern w:val="0"/>
                 <w:szCs w:val="20"/>
               </w:rPr>
-              <w:t>본부</w:t>
-            </w:r>
-            <w:proofErr w:type="spellEnd"/>
-            <w:r>
-              <w:rPr>
-                <w:rFonts w:eastAsiaTheme="minorHAnsi" w:cs="굴림" w:hint="eastAsia"/>
-                <w:b/>
-                <w:color w:val="262626" w:themeColor="text1" w:themeTint="D9"/>
-                <w:kern w:val="0"/>
-                <w:szCs w:val="20"/>
-              </w:rPr>
-              <w:t xml:space="preserve"> 확인</w:t>
+              <w:t>본부 확인</w:t>
             </w:r>
           </w:p>
         </w:tc>
@@ -1270,147 +1164,9 @@
       </w:tr>
     </w:tbl>
     <w:p>
-      <w:pPr>
-        <w:pStyle w:val="a6"/>
-        <w:wordWrap/>
-        <w:rPr>
-          <w:rFonts w:asciiTheme="minorHAnsi" w:eastAsiaTheme="minorHAnsi" w:hAnsiTheme="minorHAnsi"/>
-          <w:b/>
-          <w:sz w:val="2"/>
-          <w:szCs w:val="24"/>
-        </w:rPr>
-      </w:pPr>
-    </w:p>
-    <w:p>
-      <w:pPr>
-        <w:pStyle w:val="a6"/>
-        <w:wordWrap/>
-        <w:rPr>
-          <w:rFonts w:asciiTheme="minorHAnsi" w:eastAsiaTheme="minorHAnsi" w:hAnsiTheme="minorHAnsi"/>
-          <w:b/>
-          <w:sz w:val="2"/>
-          <w:szCs w:val="24"/>
-        </w:rPr>
-      </w:pPr>
-    </w:p>
-    <w:p>
-      <w:pPr>
-        <w:pStyle w:val="a6"/>
-        <w:wordWrap/>
-        <w:rPr>
-          <w:rFonts w:asciiTheme="minorHAnsi" w:eastAsiaTheme="minorHAnsi" w:hAnsiTheme="minorHAnsi"/>
-          <w:b/>
-          <w:sz w:val="2"/>
-          <w:szCs w:val="24"/>
-        </w:rPr>
-      </w:pPr>
-    </w:p>
-    <w:p>
-      <w:pPr>
-        <w:pStyle w:val="a6"/>
-        <w:wordWrap/>
-        <w:rPr>
-          <w:rFonts w:asciiTheme="minorHAnsi" w:eastAsiaTheme="minorHAnsi" w:hAnsiTheme="minorHAnsi"/>
-          <w:b/>
-          <w:sz w:val="2"/>
-          <w:szCs w:val="24"/>
-        </w:rPr>
-      </w:pPr>
-    </w:p>
-    <w:p>
-      <w:pPr>
-        <w:pStyle w:val="a6"/>
-        <w:wordWrap/>
-        <w:rPr>
-          <w:rFonts w:asciiTheme="minorHAnsi" w:eastAsiaTheme="minorHAnsi" w:hAnsiTheme="minorHAnsi"/>
-          <w:b/>
-          <w:sz w:val="2"/>
-          <w:szCs w:val="24"/>
-        </w:rPr>
-      </w:pPr>
-    </w:p>
-    <w:p>
-      <w:pPr>
-        <w:pStyle w:val="a6"/>
-        <w:wordWrap/>
-        <w:rPr>
-          <w:rFonts w:asciiTheme="minorHAnsi" w:eastAsiaTheme="minorHAnsi" w:hAnsiTheme="minorHAnsi"/>
-          <w:b/>
-          <w:sz w:val="2"/>
-          <w:szCs w:val="24"/>
-        </w:rPr>
-      </w:pPr>
-    </w:p>
-    <w:p>
-      <w:pPr>
-        <w:pStyle w:val="a6"/>
-        <w:wordWrap/>
-        <w:rPr>
-          <w:rFonts w:asciiTheme="minorHAnsi" w:eastAsiaTheme="minorHAnsi" w:hAnsiTheme="minorHAnsi"/>
-          <w:b/>
-          <w:sz w:val="2"/>
-          <w:szCs w:val="24"/>
-        </w:rPr>
-      </w:pPr>
-    </w:p>
-    <w:p>
-      <w:pPr>
-        <w:pStyle w:val="a6"/>
-        <w:wordWrap/>
-        <w:rPr>
-          <w:rFonts w:asciiTheme="minorHAnsi" w:eastAsiaTheme="minorHAnsi" w:hAnsiTheme="minorHAnsi"/>
-          <w:b/>
-          <w:sz w:val="2"/>
-          <w:szCs w:val="24"/>
-        </w:rPr>
-      </w:pPr>
-    </w:p>
-    <w:p>
-      <w:pPr>
-        <w:pStyle w:val="a6"/>
-        <w:wordWrap/>
-        <w:rPr>
-          <w:rFonts w:asciiTheme="minorHAnsi" w:eastAsiaTheme="minorHAnsi" w:hAnsiTheme="minorHAnsi"/>
-          <w:b/>
-          <w:sz w:val="2"/>
-          <w:szCs w:val="24"/>
-        </w:rPr>
-      </w:pPr>
-    </w:p>
-    <w:p>
-      <w:pPr>
-        <w:pStyle w:val="a6"/>
-        <w:wordWrap/>
-        <w:rPr>
-          <w:rFonts w:asciiTheme="minorHAnsi" w:eastAsiaTheme="minorHAnsi" w:hAnsiTheme="minorHAnsi"/>
-          <w:b/>
-          <w:sz w:val="2"/>
-          <w:szCs w:val="24"/>
-        </w:rPr>
-      </w:pPr>
-    </w:p>
-    <w:p>
-      <w:pPr>
-        <w:pStyle w:val="a6"/>
-        <w:wordWrap/>
-        <w:rPr>
-          <w:rFonts w:asciiTheme="minorHAnsi" w:eastAsiaTheme="minorHAnsi" w:hAnsiTheme="minorHAnsi"/>
-          <w:b/>
-          <w:sz w:val="2"/>
-          <w:szCs w:val="24"/>
-        </w:rPr>
-      </w:pPr>
-    </w:p>
-    <w:p>
-      <w:pPr>
-        <w:tabs>
-          <w:tab w:val="left" w:pos="993"/>
-        </w:tabs>
-        <w:spacing w:line="240" w:lineRule="auto"/>
-        <w:rPr>
-          <w:rFonts w:eastAsiaTheme="minorHAnsi"/>
-        </w:rPr>
-      </w:pPr>
+      <w:r>
+        <w:br w:type="page"/>
+      </w:r>
     </w:p>
     <w:tbl>
       <w:tblPr>
@@ -2736,7 +2492,6 @@
               </w:rPr>
               <w:t xml:space="preserve">. </w:t>
             </w:r>
-            <w:proofErr w:type="spellStart"/>
             <w:r>
               <w:rPr>
                 <w:rFonts w:eastAsiaTheme="minorHAnsi" w:cs="굴림" w:hint="eastAsia"/>
@@ -2744,25 +2499,7 @@
                 <w:kern w:val="0"/>
                 <w:szCs w:val="20"/>
               </w:rPr>
-              <w:t>계측기</w:t>
-            </w:r>
-            <w:proofErr w:type="spellEnd"/>
-            <w:r>
-              <w:rPr>
-                <w:rFonts w:eastAsiaTheme="minorHAnsi" w:cs="굴림" w:hint="eastAsia"/>
-                <w:color w:val="404040" w:themeColor="text1" w:themeTint="BF"/>
-                <w:kern w:val="0"/>
-                <w:szCs w:val="20"/>
-              </w:rPr>
-              <w:t xml:space="preserve"> 반출 점검</w:t>
-            </w:r>
-            <w:r>
-              <w:rPr>
-                <w:rFonts w:eastAsiaTheme="minorHAnsi" w:cs="굴림" w:hint="eastAsia"/>
-                <w:color w:val="404040" w:themeColor="text1" w:themeTint="BF"/>
-                <w:kern w:val="0"/>
-                <w:szCs w:val="20"/>
-              </w:rPr>
+              <w:t>계측기 반출 점검</w:t>
               <w:lastRenderedPageBreak/>
               <w:t>을 위해</w:t>
             </w:r>
@@ -2785,27 +2522,7 @@
                 <w:kern w:val="0"/>
                 <w:szCs w:val="20"/>
               </w:rPr>
-              <w:t xml:space="preserve">  </w:t>
-            </w:r>
-            <w:proofErr w:type="spellStart"/>
-            <w:r>
-              <w:rPr>
-                <w:rFonts w:eastAsiaTheme="minorHAnsi" w:cs="굴림" w:hint="eastAsia"/>
-                <w:color w:val="404040" w:themeColor="text1" w:themeTint="BF"/>
-                <w:kern w:val="0"/>
-                <w:szCs w:val="20"/>
-              </w:rPr>
-              <w:t>취외함</w:t>
-            </w:r>
-            <w:proofErr w:type="spellEnd"/>
-            <w:r>
-              <w:rPr>
-                <w:rFonts w:eastAsiaTheme="minorHAnsi" w:cs="굴림" w:hint="eastAsia"/>
-                <w:color w:val="404040" w:themeColor="text1" w:themeTint="BF"/>
-                <w:kern w:val="0"/>
-                <w:szCs w:val="20"/>
-              </w:rPr>
-              <w:t xml:space="preserve"> </w:t>
+              <w:t xml:space="preserve">  취외함 </w:t>
             </w:r>
           </w:p>
         </w:tc>
@@ -2838,7 +2555,6 @@
               <w:lastRenderedPageBreak/>
               <w:t xml:space="preserve">1. </w:t>
             </w:r>
-            <w:proofErr w:type="spellStart"/>
             <w:r>
               <w:rPr>
                 <w:rFonts w:eastAsiaTheme="minorHAnsi" w:cs="굴림" w:hint="eastAsia"/>
@@ -2846,25 +2562,7 @@
                 <w:kern w:val="0"/>
                 <w:szCs w:val="20"/>
               </w:rPr>
-              <w:t>계측기</w:t>
-            </w:r>
-            <w:proofErr w:type="spellEnd"/>
-            <w:r>
-              <w:rPr>
-                <w:rFonts w:eastAsiaTheme="minorHAnsi" w:cs="굴림" w:hint="eastAsia"/>
-                <w:color w:val="404040" w:themeColor="text1" w:themeTint="BF"/>
-                <w:kern w:val="0"/>
-                <w:szCs w:val="20"/>
-              </w:rPr>
-              <w:t xml:space="preserve"> 반출 점검 및 </w:t>
-            </w:r>
-            <w:r>
-              <w:rPr>
-                <w:rFonts w:eastAsiaTheme="minorHAnsi" w:cs="굴림" w:hint="eastAsia"/>
-                <w:color w:val="404040" w:themeColor="text1" w:themeTint="BF"/>
-                <w:kern w:val="0"/>
-                <w:szCs w:val="20"/>
-              </w:rPr>
+              <w:t xml:space="preserve">계측기 반출 점검 및 </w:t>
               <w:lastRenderedPageBreak/>
               <w:t>교정 요청</w:t>
             </w:r>
@@ -2886,21 +2584,12 @@
           <w:b/>
         </w:rPr>
       </w:pPr>
-      <w:proofErr w:type="spellStart"/>
       <w:r>
         <w:rPr>
           <w:rFonts w:eastAsiaTheme="minorHAnsi" w:hint="eastAsia"/>
           <w:b/>
         </w:rPr>
-        <w:t>Ⅰ</w:t>
-      </w:r>
-      <w:proofErr w:type="spellEnd"/>
-      <w:r>
-        <w:rPr>
-          <w:rFonts w:eastAsiaTheme="minorHAnsi" w:hint="eastAsia"/>
-          <w:b/>
-        </w:rPr>
-        <w:t>. 기본 Check 항목</w:t>
+        <w:t>Ⅰ. 기본 Check 항목</w:t>
       </w:r>
     </w:p>
     <w:tbl>
@@ -2970,7 +2659,6 @@
                 <w:szCs w:val="20"/>
               </w:rPr>
             </w:pPr>
-            <w:proofErr w:type="spellStart"/>
             <w:r>
               <w:rPr>
                 <w:rFonts w:eastAsiaTheme="minorHAnsi" w:cs="굴림"/>
@@ -2981,7 +2669,6 @@
               </w:rPr>
               <w:t>측정가스</w:t>
             </w:r>
-            <w:proofErr w:type="spellEnd"/>
           </w:p>
         </w:tc>
         <w:tc>
@@ -3047,26 +2734,7 @@
                 <w:kern w:val="0"/>
                 <w:szCs w:val="20"/>
               </w:rPr>
-              <w:t>ain Unit</w:t>
-            </w:r>
-            <w:r>
-              <w:rPr>
-                <w:rFonts w:eastAsiaTheme="minorHAnsi" w:cs="굴림"/>
-                <w:color w:val="404040" w:themeColor="text1" w:themeTint="BF"/>
-                <w:kern w:val="0"/>
-                <w:szCs w:val="20"/>
-              </w:rPr>
-              <w:t xml:space="preserve">  </w:t>
-            </w:r>
-            <w:proofErr w:type="gramStart"/>
-            <w:r>
-              <w:rPr>
-                <w:rFonts w:eastAsiaTheme="minorHAnsi" w:cs="굴림"/>
-                <w:color w:val="404040" w:themeColor="text1" w:themeTint="BF"/>
-                <w:kern w:val="0"/>
-                <w:szCs w:val="20"/>
-              </w:rPr>
-              <w:t xml:space="preserve">  </w:t>
+              <w:t xml:space="preserve">ain Unit    </w:t>
             </w:r>
             <w:r>
               <w:rPr>
@@ -3078,11 +2746,7 @@
               <w:t xml:space="preserve"> </w:t>
             </w:r>
             <w:r>
-              <w:t>{</w:t>
-            </w:r>
-            <w:proofErr w:type="gramEnd"/>
-            <w:r>
-              <w:t>{#CHECK_MAIN_110V}}</w:t>
+              <w:t>{{#CHECK_MAIN_110V}}</w:t>
             </w:r>
             <w:r>
               <w:rPr>
@@ -3109,11 +2773,7 @@
               <w:textAlignment w:val="baseline"/>
             </w:pPr>
             <w:r>
-              <w:t>{{#CHECK_MAIN_220V</w:t>
-            </w:r>
-            <w:proofErr w:type="gramStart"/>
-            <w:r>
-              <w:t>}}</w:t>
+              <w:t>{{#CHECK_MAIN_220V}}</w:t>
             </w:r>
             <w:r>
               <w:rPr>
@@ -3121,7 +2781,6 @@
               </w:rPr>
               <w:t>☑</w:t>
             </w:r>
-            <w:proofErr w:type="gramEnd"/>
             <w:r>
               <w:t>{{/CHECK_MAIN_220V}}{{^CHECK_MAIN_220V}}</w:t>
             </w:r>
@@ -3206,11 +2865,7 @@
               <w:textAlignment w:val="baseline"/>
             </w:pPr>
             <w:r>
-              <w:t>{{#CHECK_PURGE_220V</w:t>
-            </w:r>
-            <w:proofErr w:type="gramStart"/>
-            <w:r>
-              <w:t>}}</w:t>
+              <w:t>{{#CHECK_PURGE_220V}}</w:t>
             </w:r>
             <w:r>
               <w:rPr>
@@ -3218,7 +2873,6 @@
               </w:rPr>
               <w:t>☑</w:t>
             </w:r>
-            <w:proofErr w:type="gramEnd"/>
             <w:r>
               <w:t>{{/CHECK_PURGE_220V}}{{^CHECK_PURGE_220V}}</w:t>
             </w:r>
@@ -3302,17 +2956,7 @@
                 <w:kern w:val="0"/>
                 <w:szCs w:val="20"/>
               </w:rPr>
-              <w:t>{{#CHECK_GAS_NOX</w:t>
-            </w:r>
-            <w:proofErr w:type="gramStart"/>
-            <w:r>
-              <w:rPr>
-                <w:rFonts w:eastAsiaTheme="minorHAnsi" w:cs="굴림"/>
-                <w:color w:val="404040" w:themeColor="text1" w:themeTint="BF"/>
-                <w:kern w:val="0"/>
-                <w:szCs w:val="20"/>
-              </w:rPr>
-              <w:t>}}</w:t>
+              <w:t>{{#CHECK_GAS_NOX}}</w:t>
             </w:r>
             <w:r>
               <w:rPr>
@@ -3323,7 +2967,6 @@
               </w:rPr>
               <w:t>☑</w:t>
             </w:r>
-            <w:proofErr w:type="gramEnd"/>
             <w:r>
               <w:rPr>
                 <w:rFonts w:eastAsiaTheme="minorHAnsi" w:cs="굴림"/>
@@ -3418,17 +3061,7 @@
                 <w:kern w:val="0"/>
                 <w:szCs w:val="20"/>
               </w:rPr>
-              <w:t>{{#CHECK_GAS_SO2</w:t>
-            </w:r>
-            <w:proofErr w:type="gramStart"/>
-            <w:r>
-              <w:rPr>
-                <w:rFonts w:eastAsiaTheme="minorHAnsi" w:cs="굴림"/>
-                <w:color w:val="404040" w:themeColor="text1" w:themeTint="BF"/>
-                <w:kern w:val="0"/>
-                <w:szCs w:val="20"/>
-              </w:rPr>
-              <w:t>}}</w:t>
+              <w:t>{{#CHECK_GAS_SO2}}</w:t>
             </w:r>
             <w:r>
               <w:rPr>
@@ -3439,7 +3072,6 @@
               </w:rPr>
               <w:t>☑</w:t>
             </w:r>
-            <w:proofErr w:type="gramEnd"/>
             <w:r>
               <w:rPr>
                 <w:rFonts w:eastAsiaTheme="minorHAnsi" w:cs="굴림"/>
@@ -3534,17 +3166,7 @@
                 <w:kern w:val="0"/>
                 <w:szCs w:val="20"/>
               </w:rPr>
-              <w:t>{{#CHECK_GAS_CO</w:t>
-            </w:r>
-            <w:proofErr w:type="gramStart"/>
-            <w:r>
-              <w:rPr>
-                <w:rFonts w:eastAsiaTheme="minorHAnsi" w:cs="굴림"/>
-                <w:color w:val="404040" w:themeColor="text1" w:themeTint="BF"/>
-                <w:kern w:val="0"/>
-                <w:szCs w:val="20"/>
-              </w:rPr>
-              <w:t>}}</w:t>
+              <w:t>{{#CHECK_GAS_CO}}</w:t>
             </w:r>
             <w:r>
               <w:rPr>
@@ -3555,7 +3177,6 @@
               </w:rPr>
               <w:t>☑</w:t>
             </w:r>
-            <w:proofErr w:type="gramEnd"/>
             <w:r>
               <w:rPr>
                 <w:rFonts w:eastAsiaTheme="minorHAnsi" w:cs="굴림"/>
@@ -3617,19 +3238,8 @@
                 <w:kern w:val="0"/>
                 <w:szCs w:val="20"/>
               </w:rPr>
-              <w:t xml:space="preserve">{{/CHECK_GAS_HCL}} </w:t>
-            </w:r>
-            <w:proofErr w:type="spellStart"/>
-            <w:r>
-              <w:rPr>
-                <w:rFonts w:eastAsiaTheme="minorHAnsi" w:cs="굴림"/>
-                <w:color w:val="404040" w:themeColor="text1" w:themeTint="BF"/>
-                <w:kern w:val="0"/>
-                <w:szCs w:val="20"/>
-              </w:rPr>
-              <w:t>HCl</w:t>
-            </w:r>
-            <w:proofErr w:type="spellEnd"/>
+              <w:t>{{/CHECK_GAS_HCL}} HCl</w:t>
+            </w:r>
           </w:p>
           <w:p>
             <w:pPr>
@@ -3662,17 +3272,7 @@
                 <w:szCs w:val="20"/>
               </w:rPr>
               <w:lastRenderedPageBreak/>
-              <w:t>{{#CHECK_GAS_O2</w:t>
-            </w:r>
-            <w:proofErr w:type="gramStart"/>
-            <w:r>
-              <w:rPr>
-                <w:rFonts w:eastAsiaTheme="minorHAnsi" w:cs="굴림"/>
-                <w:color w:val="404040" w:themeColor="text1" w:themeTint="BF"/>
-                <w:kern w:val="0"/>
-                <w:szCs w:val="20"/>
-              </w:rPr>
-              <w:t>}}</w:t>
+              <w:t>{{#CHECK_GAS_O2}}</w:t>
             </w:r>
             <w:r>
               <w:rPr>
@@ -3683,7 +3283,6 @@
               </w:rPr>
               <w:t>☑</w:t>
             </w:r>
-            <w:proofErr w:type="gramEnd"/>
             <w:r>
               <w:rPr>
                 <w:rFonts w:eastAsiaTheme="minorHAnsi" w:cs="굴림"/>
@@ -3855,17 +3454,7 @@
                 <w:kern w:val="0"/>
                 <w:szCs w:val="20"/>
               </w:rPr>
-              <w:t>{{#CHECK_INSTALL_BLR</w:t>
-            </w:r>
-            <w:proofErr w:type="gramStart"/>
-            <w:r>
-              <w:rPr>
-                <w:rFonts w:eastAsiaTheme="minorHAnsi" w:cs="굴림"/>
-                <w:color w:val="404040" w:themeColor="text1" w:themeTint="BF"/>
-                <w:kern w:val="0"/>
-                <w:szCs w:val="20"/>
-              </w:rPr>
-              <w:t>}}</w:t>
+              <w:t>{{#CHECK_INSTALL_BLR}}</w:t>
             </w:r>
             <w:r>
               <w:rPr>
@@ -3876,7 +3465,6 @@
               </w:rPr>
               <w:t>☑</w:t>
             </w:r>
-            <w:proofErr w:type="gramEnd"/>
             <w:r>
               <w:rPr>
                 <w:rFonts w:eastAsiaTheme="minorHAnsi" w:cs="굴림"/>
@@ -3973,17 +3561,7 @@
                 <w:kern w:val="0"/>
                 <w:szCs w:val="20"/>
               </w:rPr>
-              <w:t>{{#CHECK_INSTALL_ESP</w:t>
-            </w:r>
-            <w:proofErr w:type="gramStart"/>
-            <w:r>
-              <w:rPr>
-                <w:rFonts w:eastAsiaTheme="minorHAnsi" w:cs="굴림"/>
-                <w:color w:val="404040" w:themeColor="text1" w:themeTint="BF"/>
-                <w:kern w:val="0"/>
-                <w:szCs w:val="20"/>
-              </w:rPr>
-              <w:t>}}</w:t>
+              <w:t>{{#CHECK_INSTALL_ESP}}</w:t>
             </w:r>
             <w:r>
               <w:rPr>
@@ -3994,7 +3572,6 @@
               </w:rPr>
               <w:t>☑</w:t>
             </w:r>
-            <w:proofErr w:type="gramEnd"/>
             <w:r>
               <w:rPr>
                 <w:rFonts w:eastAsiaTheme="minorHAnsi" w:cs="굴림"/>
@@ -4091,17 +3668,7 @@
                 <w:kern w:val="0"/>
                 <w:szCs w:val="20"/>
               </w:rPr>
-              <w:t>{{#CHECK_INSTALL_TMS</w:t>
-            </w:r>
-            <w:proofErr w:type="gramStart"/>
-            <w:r>
-              <w:rPr>
-                <w:rFonts w:eastAsiaTheme="minorHAnsi" w:cs="굴림"/>
-                <w:color w:val="404040" w:themeColor="text1" w:themeTint="BF"/>
-                <w:kern w:val="0"/>
-                <w:szCs w:val="20"/>
-              </w:rPr>
-              <w:t>}}</w:t>
+              <w:t>{{#CHECK_INSTALL_TMS}}</w:t>
             </w:r>
             <w:r>
               <w:rPr>
@@ -4112,7 +3679,6 @@
               </w:rPr>
               <w:t>☑</w:t>
             </w:r>
-            <w:proofErr w:type="gramEnd"/>
             <w:r>
               <w:rPr>
                 <w:rFonts w:eastAsiaTheme="minorHAnsi" w:cs="굴림"/>
@@ -4210,14 +3776,6 @@
                 <w:szCs w:val="20"/>
               </w:rPr>
               <w:t xml:space="preserve">{{/CHECK_INSTALL_ETC}} 기타 </w:t>
-            </w:r>
-            <w:r>
-              <w:rPr>
-                <w:rFonts w:eastAsiaTheme="minorHAnsi" w:cs="굴림"/>
-                <w:color w:val="404040" w:themeColor="text1" w:themeTint="BF"/>
-                <w:kern w:val="0"/>
-                <w:szCs w:val="20"/>
-              </w:rPr>
               <w:lastRenderedPageBreak/>
               <w:t>({{INSTALL_ETC_TEXT}})</w:t>
             </w:r>
@@ -4252,23 +3810,13 @@
           <w:color w:val="auto"/>
         </w:rPr>
       </w:pPr>
-      <w:proofErr w:type="spellStart"/>
       <w:r>
         <w:rPr>
           <w:rFonts w:asciiTheme="minorHAnsi" w:eastAsiaTheme="minorHAnsi" w:hAnsiTheme="minorHAnsi" w:hint="eastAsia"/>
           <w:b/>
           <w:color w:val="auto"/>
         </w:rPr>
-        <w:t>Ⅱ</w:t>
-      </w:r>
-      <w:proofErr w:type="spellEnd"/>
-      <w:r>
-        <w:rPr>
-          <w:rFonts w:asciiTheme="minorHAnsi" w:eastAsiaTheme="minorHAnsi" w:hAnsiTheme="minorHAnsi" w:hint="eastAsia"/>
-          <w:b/>
-          <w:color w:val="auto"/>
-        </w:rPr>
-        <w:t xml:space="preserve">. </w:t>
+        <w:t xml:space="preserve">Ⅱ. </w:t>
       </w:r>
       <w:r>
         <w:rPr>
@@ -4445,7 +3993,6 @@
                 <w:sz w:val="18"/>
               </w:rPr>
             </w:pPr>
-            <w:proofErr w:type="spellStart"/>
             <w:r>
               <w:rPr>
                 <w:rFonts w:eastAsiaTheme="minorHAnsi" w:cs="굴림" w:hint="eastAsia"/>
@@ -4455,7 +4002,6 @@
               </w:rPr>
               <w:t>조치결과</w:t>
             </w:r>
-            <w:proofErr w:type="spellEnd"/>
           </w:p>
         </w:tc>
       </w:tr>
@@ -4484,7 +4030,6 @@
                 <w:szCs w:val="18"/>
               </w:rPr>
             </w:pPr>
-            <w:proofErr w:type="spellStart"/>
             <w:r>
               <w:rPr>
                 <w:rFonts w:eastAsiaTheme="minorHAnsi" w:cs="굴림"/>
@@ -4495,7 +4040,6 @@
               </w:rPr>
               <w:t>광학부</w:t>
             </w:r>
-            <w:proofErr w:type="spellEnd"/>
           </w:p>
         </w:tc>
         <w:tc>
@@ -4668,29 +4212,7 @@
                 <w:sz w:val="18"/>
                 <w:szCs w:val="18"/>
               </w:rPr>
-              <w:t xml:space="preserve">{{/CHECK_BEAMSPLITTER_NEED}} </w:t>
-            </w:r>
-            <w:proofErr w:type="spellStart"/>
-            <w:r>
-              <w:rPr>
-                <w:rFonts w:eastAsiaTheme="minorHAnsi" w:cs="굴림"/>
-                <w:color w:val="404040" w:themeColor="text1" w:themeTint="BF"/>
-                <w:kern w:val="0"/>
-                <w:sz w:val="18"/>
-                <w:szCs w:val="18"/>
-              </w:rPr>
-              <w:t>추가점검</w:t>
-            </w:r>
-            <w:proofErr w:type="spellEnd"/>
-            <w:r>
-              <w:rPr>
-                <w:rFonts w:eastAsiaTheme="minorHAnsi" w:cs="굴림"/>
-                <w:color w:val="404040" w:themeColor="text1" w:themeTint="BF"/>
-                <w:kern w:val="0"/>
-                <w:sz w:val="18"/>
-                <w:szCs w:val="18"/>
-              </w:rPr>
-              <w:t xml:space="preserve"> 필요</w:t>
+              <w:t>{{/CHECK_BEAMSPLITTER_NEED}} 추가점검 필요</w:t>
             </w:r>
           </w:p>
         </w:tc>
@@ -4921,27 +4443,7 @@
                 <w:kern w:val="0"/>
                 <w:szCs w:val="20"/>
               </w:rPr>
-              <w:t xml:space="preserve">{{/CHECK_FOCUSINGLENS_NEED}} </w:t>
-            </w:r>
-            <w:proofErr w:type="spellStart"/>
-            <w:r>
-              <w:rPr>
-                <w:rFonts w:eastAsiaTheme="minorHAnsi" w:cs="굴림"/>
-                <w:color w:val="404040" w:themeColor="text1" w:themeTint="BF"/>
-                <w:kern w:val="0"/>
-                <w:szCs w:val="20"/>
-              </w:rPr>
-              <w:t>추가점검</w:t>
-            </w:r>
-            <w:proofErr w:type="spellEnd"/>
-            <w:r>
-              <w:rPr>
-                <w:rFonts w:eastAsiaTheme="minorHAnsi" w:cs="굴림"/>
-                <w:color w:val="404040" w:themeColor="text1" w:themeTint="BF"/>
-                <w:kern w:val="0"/>
-                <w:szCs w:val="20"/>
-              </w:rPr>
-              <w:t xml:space="preserve"> 필요</w:t>
+              <w:t>{{/CHECK_FOCUSINGLENS_NEED}} 추가점검 필요</w:t>
             </w:r>
           </w:p>
         </w:tc>
@@ -5172,27 +4674,7 @@
                 <w:kern w:val="0"/>
                 <w:szCs w:val="20"/>
               </w:rPr>
-              <w:t xml:space="preserve">{{/CHECK_MUWINDOW_NEED}} </w:t>
-            </w:r>
-            <w:proofErr w:type="spellStart"/>
-            <w:r>
-              <w:rPr>
-                <w:rFonts w:eastAsiaTheme="minorHAnsi" w:cs="굴림"/>
-                <w:color w:val="404040" w:themeColor="text1" w:themeTint="BF"/>
-                <w:kern w:val="0"/>
-                <w:szCs w:val="20"/>
-              </w:rPr>
-              <w:t>추가점검</w:t>
-            </w:r>
-            <w:proofErr w:type="spellEnd"/>
-            <w:r>
-              <w:rPr>
-                <w:rFonts w:eastAsiaTheme="minorHAnsi" w:cs="굴림"/>
-                <w:color w:val="404040" w:themeColor="text1" w:themeTint="BF"/>
-                <w:kern w:val="0"/>
-                <w:szCs w:val="20"/>
-              </w:rPr>
-              <w:t xml:space="preserve"> 필요</w:t>
+              <w:t>{{/CHECK_MUWINDOW_NEED}} 추가점검 필요</w:t>
             </w:r>
           </w:p>
         </w:tc>
@@ -5298,15 +4780,6 @@
                 <w:szCs w:val="18"/>
               </w:rPr>
               <w:t>스펙트</w:t>
-            </w:r>
-            <w:r>
-              <w:rPr>
-                <w:rFonts w:eastAsiaTheme="minorHAnsi" w:cs="굴림" w:hint="eastAsia"/>
-                <w:color w:val="404040" w:themeColor="text1" w:themeTint="BF"/>
-                <w:kern w:val="0"/>
-                <w:sz w:val="18"/>
-                <w:szCs w:val="18"/>
-              </w:rPr>
               <w:lastRenderedPageBreak/>
               <w:t>럼 형상</w:t>
             </w:r>
@@ -5431,27 +4904,7 @@
                 <w:kern w:val="0"/>
                 <w:szCs w:val="20"/>
               </w:rPr>
-              <w:t xml:space="preserve">{{/CHECK_SPECTRUM_NEED}} </w:t>
-            </w:r>
-            <w:proofErr w:type="spellStart"/>
-            <w:r>
-              <w:rPr>
-                <w:rFonts w:eastAsiaTheme="minorHAnsi" w:cs="굴림"/>
-                <w:color w:val="404040" w:themeColor="text1" w:themeTint="BF"/>
-                <w:kern w:val="0"/>
-                <w:szCs w:val="20"/>
-              </w:rPr>
-              <w:t>추가점검</w:t>
-            </w:r>
-            <w:proofErr w:type="spellEnd"/>
-            <w:r>
-              <w:rPr>
-                <w:rFonts w:eastAsiaTheme="minorHAnsi" w:cs="굴림"/>
-                <w:color w:val="404040" w:themeColor="text1" w:themeTint="BF"/>
-                <w:kern w:val="0"/>
-                <w:szCs w:val="20"/>
-              </w:rPr>
-              <w:t xml:space="preserve"> 필요</w:t>
+              <w:t>{{/CHECK_SPECTRUM_NEED}} 추가점검 필요</w:t>
             </w:r>
           </w:p>
         </w:tc>
@@ -5667,27 +5120,7 @@
                 <w:kern w:val="0"/>
                 <w:szCs w:val="20"/>
               </w:rPr>
-              <w:t xml:space="preserve">{{/CHECK_SIGNAL_NEED}} </w:t>
-            </w:r>
-            <w:proofErr w:type="spellStart"/>
-            <w:r>
-              <w:rPr>
-                <w:rFonts w:eastAsiaTheme="minorHAnsi" w:cs="굴림"/>
-                <w:color w:val="404040" w:themeColor="text1" w:themeTint="BF"/>
-                <w:kern w:val="0"/>
-                <w:szCs w:val="20"/>
-              </w:rPr>
-              <w:t>추가점검</w:t>
-            </w:r>
-            <w:proofErr w:type="spellEnd"/>
-            <w:r>
-              <w:rPr>
-                <w:rFonts w:eastAsiaTheme="minorHAnsi" w:cs="굴림"/>
-                <w:color w:val="404040" w:themeColor="text1" w:themeTint="BF"/>
-                <w:kern w:val="0"/>
-                <w:szCs w:val="20"/>
-              </w:rPr>
-              <w:t xml:space="preserve"> 필요</w:t>
+              <w:t>{{/CHECK_SIGNAL_NEED}} 추가점검 필요</w:t>
             </w:r>
           </w:p>
         </w:tc>
@@ -5946,27 +5379,7 @@
                 <w:kern w:val="0"/>
                 <w:szCs w:val="20"/>
               </w:rPr>
-              <w:t xml:space="preserve">{{/CHECK_UVLAMP_NEED}} </w:t>
-            </w:r>
-            <w:proofErr w:type="spellStart"/>
-            <w:r>
-              <w:rPr>
-                <w:rFonts w:eastAsiaTheme="minorHAnsi" w:cs="굴림"/>
-                <w:color w:val="404040" w:themeColor="text1" w:themeTint="BF"/>
-                <w:kern w:val="0"/>
-                <w:szCs w:val="20"/>
-              </w:rPr>
-              <w:t>추가점검</w:t>
-            </w:r>
-            <w:proofErr w:type="spellEnd"/>
-            <w:r>
-              <w:rPr>
-                <w:rFonts w:eastAsiaTheme="minorHAnsi" w:cs="굴림"/>
-                <w:color w:val="404040" w:themeColor="text1" w:themeTint="BF"/>
-                <w:kern w:val="0"/>
-                <w:szCs w:val="20"/>
-              </w:rPr>
-              <w:t xml:space="preserve"> 필요</w:t>
+              <w:t>{{/CHECK_UVLAMP_NEED}} 추가점검 필요</w:t>
             </w:r>
           </w:p>
         </w:tc>
@@ -6202,27 +5615,7 @@
                 <w:kern w:val="0"/>
                 <w:szCs w:val="20"/>
               </w:rPr>
-              <w:t xml:space="preserve">{{/CHECK_DCOUTPUT_NEED}} </w:t>
-            </w:r>
-            <w:proofErr w:type="spellStart"/>
-            <w:r>
-              <w:rPr>
-                <w:rFonts w:eastAsiaTheme="minorHAnsi" w:cs="굴림"/>
-                <w:color w:val="404040" w:themeColor="text1" w:themeTint="BF"/>
-                <w:kern w:val="0"/>
-                <w:szCs w:val="20"/>
-              </w:rPr>
-              <w:t>추가점검</w:t>
-            </w:r>
-            <w:proofErr w:type="spellEnd"/>
-            <w:r>
-              <w:rPr>
-                <w:rFonts w:eastAsiaTheme="minorHAnsi" w:cs="굴림"/>
-                <w:color w:val="404040" w:themeColor="text1" w:themeTint="BF"/>
-                <w:kern w:val="0"/>
-                <w:szCs w:val="20"/>
-              </w:rPr>
-              <w:t xml:space="preserve"> 필요</w:t>
+              <w:t>{{/CHECK_DCOUTPUT_NEED}} 추가점검 필요</w:t>
             </w:r>
           </w:p>
         </w:tc>
@@ -6336,25 +5729,7 @@
                 <w:sz w:val="18"/>
                 <w:szCs w:val="18"/>
               </w:rPr>
-              <w:t xml:space="preserve">, </w:t>
-            </w:r>
-            <w:r>
-              <w:rPr>
-                <w:rFonts w:asciiTheme="minorHAnsi" w:eastAsiaTheme="minorHAnsi" w:hAnsiTheme="minorHAnsi"/>
-                <w:color w:val="404040" w:themeColor="text1" w:themeTint="BF"/>
-                <w:sz w:val="18"/>
-                <w:szCs w:val="18"/>
-              </w:rPr>
-              <w:t>12V</w:t>
-            </w:r>
-            <w:r>
-              <w:rPr>
-                <w:rFonts w:asciiTheme="minorHAnsi" w:eastAsiaTheme="minorHAnsi" w:hAnsiTheme="minorHAnsi"/>
-                <w:color w:val="404040" w:themeColor="text1" w:themeTint="BF"/>
-                <w:sz w:val="18"/>
-                <w:szCs w:val="18"/>
-              </w:rPr>
-              <w:t xml:space="preserve"> , 24V</w:t>
+              <w:t>, 12V , 24V</w:t>
             </w:r>
           </w:p>
         </w:tc>
@@ -6502,27 +5877,7 @@
                 <w:kern w:val="0"/>
                 <w:szCs w:val="20"/>
               </w:rPr>
-              <w:t xml:space="preserve">{{/CHECK_SMPS_NEED}} </w:t>
-            </w:r>
-            <w:proofErr w:type="spellStart"/>
-            <w:r>
-              <w:rPr>
-                <w:rFonts w:eastAsiaTheme="minorHAnsi" w:cs="굴림"/>
-                <w:color w:val="404040" w:themeColor="text1" w:themeTint="BF"/>
-                <w:kern w:val="0"/>
-                <w:szCs w:val="20"/>
-              </w:rPr>
-              <w:t>추가점검</w:t>
-            </w:r>
-            <w:proofErr w:type="spellEnd"/>
-            <w:r>
-              <w:rPr>
-                <w:rFonts w:eastAsiaTheme="minorHAnsi" w:cs="굴림"/>
-                <w:color w:val="404040" w:themeColor="text1" w:themeTint="BF"/>
-                <w:kern w:val="0"/>
-                <w:szCs w:val="20"/>
-              </w:rPr>
-              <w:t xml:space="preserve"> 필요</w:t>
+              <w:t>{{/CHECK_SMPS_NEED}} 추가점검 필요</w:t>
             </w:r>
           </w:p>
         </w:tc>
@@ -6758,27 +6113,7 @@
                 <w:kern w:val="0"/>
                 <w:szCs w:val="20"/>
               </w:rPr>
-              <w:t xml:space="preserve">{{/CHECK_WIRING_NEED}} </w:t>
-            </w:r>
-            <w:proofErr w:type="spellStart"/>
-            <w:r>
-              <w:rPr>
-                <w:rFonts w:eastAsiaTheme="minorHAnsi" w:cs="굴림"/>
-                <w:color w:val="404040" w:themeColor="text1" w:themeTint="BF"/>
-                <w:kern w:val="0"/>
-                <w:szCs w:val="20"/>
-              </w:rPr>
-              <w:t>추가점검</w:t>
-            </w:r>
-            <w:proofErr w:type="spellEnd"/>
-            <w:r>
-              <w:rPr>
-                <w:rFonts w:eastAsiaTheme="minorHAnsi" w:cs="굴림"/>
-                <w:color w:val="404040" w:themeColor="text1" w:themeTint="BF"/>
-                <w:kern w:val="0"/>
-                <w:szCs w:val="20"/>
-              </w:rPr>
-              <w:t xml:space="preserve"> 필요</w:t>
+              <w:t>{{/CHECK_WIRING_NEED}} 추가점검 필요</w:t>
             </w:r>
           </w:p>
         </w:tc>
@@ -6852,16 +6187,7 @@
                 <w:sz w:val="16"/>
                 <w:szCs w:val="16"/>
               </w:rPr>
-              <w:t xml:space="preserve">Main </w:t>
-            </w:r>
-            <w:r>
-              <w:rPr>
-                <w:rFonts w:asciiTheme="minorHAnsi" w:eastAsiaTheme="minorHAnsi" w:hAnsiTheme="minorHAnsi"/>
-                <w:color w:val="404040" w:themeColor="text1" w:themeTint="BF"/>
-                <w:sz w:val="16"/>
-                <w:szCs w:val="16"/>
-              </w:rPr>
-              <w:t>Control CPU Board</w:t>
+              <w:t>Main Control CPU Board</w:t>
             </w:r>
           </w:p>
         </w:tc>
@@ -7031,27 +6357,7 @@
                 <w:kern w:val="0"/>
                 <w:szCs w:val="20"/>
               </w:rPr>
-              <w:t xml:space="preserve">{{/CHECK_CPU_NEED}} </w:t>
-            </w:r>
-            <w:proofErr w:type="spellStart"/>
-            <w:r>
-              <w:rPr>
-                <w:rFonts w:eastAsiaTheme="minorHAnsi" w:cs="굴림"/>
-                <w:color w:val="404040" w:themeColor="text1" w:themeTint="BF"/>
-                <w:kern w:val="0"/>
-                <w:szCs w:val="20"/>
-              </w:rPr>
-              <w:t>추가점검</w:t>
-            </w:r>
-            <w:proofErr w:type="spellEnd"/>
-            <w:r>
-              <w:rPr>
-                <w:rFonts w:eastAsiaTheme="minorHAnsi" w:cs="굴림"/>
-                <w:color w:val="404040" w:themeColor="text1" w:themeTint="BF"/>
-                <w:kern w:val="0"/>
-                <w:szCs w:val="20"/>
-              </w:rPr>
-              <w:t xml:space="preserve"> 필요</w:t>
+              <w:t>{{/CHECK_CPU_NEED}} 추가점검 필요</w:t>
             </w:r>
           </w:p>
         </w:tc>
@@ -7124,16 +6430,7 @@
                 <w:sz w:val="18"/>
                 <w:szCs w:val="18"/>
               </w:rPr>
-              <w:t xml:space="preserve">냉각 </w:t>
-            </w:r>
-            <w:r>
-              <w:rPr>
-                <w:rFonts w:asciiTheme="minorHAnsi" w:eastAsiaTheme="minorHAnsi" w:hAnsiTheme="minorHAnsi" w:hint="eastAsia"/>
-                <w:color w:val="404040" w:themeColor="text1" w:themeTint="BF"/>
-                <w:sz w:val="18"/>
-                <w:szCs w:val="18"/>
-              </w:rPr>
-              <w:t>팬</w:t>
+              <w:t>냉각 팬</w:t>
             </w:r>
           </w:p>
         </w:tc>
@@ -7281,27 +6578,7 @@
                 <w:kern w:val="0"/>
                 <w:szCs w:val="20"/>
               </w:rPr>
-              <w:t xml:space="preserve">{{/CHECK_COOLINGFAN_OPERATION_NEED}} </w:t>
-            </w:r>
-            <w:proofErr w:type="spellStart"/>
-            <w:r>
-              <w:rPr>
-                <w:rFonts w:eastAsiaTheme="minorHAnsi" w:cs="굴림"/>
-                <w:color w:val="404040" w:themeColor="text1" w:themeTint="BF"/>
-                <w:kern w:val="0"/>
-                <w:szCs w:val="20"/>
-              </w:rPr>
-              <w:t>추가점검</w:t>
-            </w:r>
-            <w:proofErr w:type="spellEnd"/>
-            <w:r>
-              <w:rPr>
-                <w:rFonts w:eastAsiaTheme="minorHAnsi" w:cs="굴림"/>
-                <w:color w:val="404040" w:themeColor="text1" w:themeTint="BF"/>
-                <w:kern w:val="0"/>
-                <w:szCs w:val="20"/>
-              </w:rPr>
-              <w:t xml:space="preserve"> 필요</w:t>
+              <w:t>{{/CHECK_COOLINGFAN_OPERATION_NEED}} 추가점검 필요</w:t>
             </w:r>
           </w:p>
         </w:tc>
@@ -7368,7 +6645,6 @@
                 <w:szCs w:val="18"/>
               </w:rPr>
             </w:pPr>
-            <w:proofErr w:type="spellStart"/>
             <w:r>
               <w:rPr>
                 <w:rFonts w:asciiTheme="minorHAnsi" w:eastAsiaTheme="minorHAnsi" w:hAnsiTheme="minorHAnsi" w:hint="eastAsia"/>
@@ -7379,7 +6655,6 @@
               <w:lastRenderedPageBreak/>
               <w:t>프로브</w:t>
             </w:r>
-            <w:proofErr w:type="spellEnd"/>
           </w:p>
         </w:tc>
         <w:tc>
@@ -7526,27 +6801,7 @@
                 <w:kern w:val="0"/>
                 <w:szCs w:val="20"/>
               </w:rPr>
-              <w:t xml:space="preserve">{{/CHECK_PROBE_APPEARANCE_NEED}} </w:t>
-            </w:r>
-            <w:proofErr w:type="spellStart"/>
-            <w:r>
-              <w:rPr>
-                <w:rFonts w:eastAsiaTheme="minorHAnsi" w:cs="굴림"/>
-                <w:color w:val="404040" w:themeColor="text1" w:themeTint="BF"/>
-                <w:kern w:val="0"/>
-                <w:szCs w:val="20"/>
-              </w:rPr>
-              <w:t>추가점검</w:t>
-            </w:r>
-            <w:proofErr w:type="spellEnd"/>
-            <w:r>
-              <w:rPr>
-                <w:rFonts w:eastAsiaTheme="minorHAnsi" w:cs="굴림"/>
-                <w:color w:val="404040" w:themeColor="text1" w:themeTint="BF"/>
-                <w:kern w:val="0"/>
-                <w:szCs w:val="20"/>
-              </w:rPr>
-              <w:t xml:space="preserve"> 필요</w:t>
+              <w:t>{{/CHECK_PROBE_APPEARANCE_NEED}} 추가점검 필요</w:t>
             </w:r>
           </w:p>
         </w:tc>
@@ -7782,27 +7037,7 @@
                 <w:kern w:val="0"/>
                 <w:szCs w:val="20"/>
               </w:rPr>
-              <w:t xml:space="preserve">{{/CHECK_PROBE_TEMPSENSOR_NEED}} </w:t>
-            </w:r>
-            <w:proofErr w:type="spellStart"/>
-            <w:r>
-              <w:rPr>
-                <w:rFonts w:eastAsiaTheme="minorHAnsi" w:cs="굴림"/>
-                <w:color w:val="404040" w:themeColor="text1" w:themeTint="BF"/>
-                <w:kern w:val="0"/>
-                <w:szCs w:val="20"/>
-              </w:rPr>
-              <w:t>추가점검</w:t>
-            </w:r>
-            <w:proofErr w:type="spellEnd"/>
-            <w:r>
-              <w:rPr>
-                <w:rFonts w:eastAsiaTheme="minorHAnsi" w:cs="굴림"/>
-                <w:color w:val="404040" w:themeColor="text1" w:themeTint="BF"/>
-                <w:kern w:val="0"/>
-                <w:szCs w:val="20"/>
-              </w:rPr>
-              <w:t xml:space="preserve"> 필요</w:t>
+              <w:t>{{/CHECK_PROBE_TEMPSENSOR_NEED}} 추가점검 필요</w:t>
             </w:r>
           </w:p>
         </w:tc>
@@ -7889,7 +7124,6 @@
                 <w:szCs w:val="18"/>
               </w:rPr>
             </w:pPr>
-            <w:proofErr w:type="spellStart"/>
             <w:r>
               <w:rPr>
                 <w:rFonts w:asciiTheme="minorHAnsi" w:eastAsiaTheme="minorHAnsi" w:hAnsiTheme="minorHAnsi" w:hint="eastAsia"/>
@@ -7897,17 +7131,7 @@
                 <w:sz w:val="18"/>
                 <w:szCs w:val="18"/>
               </w:rPr>
-              <w:t>코너큐브</w:t>
-            </w:r>
-            <w:proofErr w:type="spellEnd"/>
-            <w:r>
-              <w:rPr>
-                <w:rFonts w:asciiTheme="minorHAnsi" w:eastAsiaTheme="minorHAnsi" w:hAnsiTheme="minorHAnsi" w:hint="eastAsia"/>
-                <w:color w:val="404040" w:themeColor="text1" w:themeTint="BF"/>
-                <w:sz w:val="18"/>
-                <w:szCs w:val="18"/>
-              </w:rPr>
-              <w:t xml:space="preserve"> 미러</w:t>
+              <w:t>코너큐브 미러</w:t>
             </w:r>
           </w:p>
         </w:tc>
@@ -8026,27 +7250,7 @@
                 <w:kern w:val="0"/>
                 <w:szCs w:val="20"/>
               </w:rPr>
-              <w:t xml:space="preserve">{{/CHECK_PROBE_CORNERMIRROR_NEED}} </w:t>
-            </w:r>
-            <w:proofErr w:type="spellStart"/>
-            <w:r>
-              <w:rPr>
-                <w:rFonts w:eastAsiaTheme="minorHAnsi" w:cs="굴림"/>
-                <w:color w:val="404040" w:themeColor="text1" w:themeTint="BF"/>
-                <w:kern w:val="0"/>
-                <w:szCs w:val="20"/>
-              </w:rPr>
-              <w:t>추가점검</w:t>
-            </w:r>
-            <w:proofErr w:type="spellEnd"/>
-            <w:r>
-              <w:rPr>
-                <w:rFonts w:eastAsiaTheme="minorHAnsi" w:cs="굴림"/>
-                <w:color w:val="404040" w:themeColor="text1" w:themeTint="BF"/>
-                <w:kern w:val="0"/>
-                <w:szCs w:val="20"/>
-              </w:rPr>
-              <w:t xml:space="preserve"> 필요</w:t>
+              <w:t>{{/CHECK_PROBE_CORNERMIRROR_NEED}} 추가점검 필요</w:t>
             </w:r>
           </w:p>
         </w:tc>
@@ -8112,21 +7316,12 @@
           <w:b/>
         </w:rPr>
       </w:pPr>
-      <w:proofErr w:type="spellStart"/>
       <w:r>
         <w:rPr>
           <w:rFonts w:eastAsiaTheme="minorHAnsi" w:hint="eastAsia"/>
           <w:b/>
         </w:rPr>
-        <w:t>Ⅲ</w:t>
-      </w:r>
-      <w:proofErr w:type="spellEnd"/>
-      <w:r>
-        <w:rPr>
-          <w:rFonts w:eastAsiaTheme="minorHAnsi" w:hint="eastAsia"/>
-          <w:b/>
-        </w:rPr>
-        <w:t xml:space="preserve">. 교체 </w:t>
+        <w:t xml:space="preserve">Ⅲ. 교체 </w:t>
       </w:r>
       <w:r>
         <w:rPr>
@@ -8347,7 +7542,6 @@
                 <w:szCs w:val="20"/>
               </w:rPr>
             </w:pPr>
-            <w:proofErr w:type="spellStart"/>
             <w:r>
               <w:rPr>
                 <w:rFonts w:eastAsiaTheme="minorHAnsi" w:cs="굴림" w:hint="eastAsia"/>
@@ -8357,7 +7551,6 @@
               </w:rPr>
               <w:t>조치결과</w:t>
             </w:r>
-            <w:proofErr w:type="spellEnd"/>
           </w:p>
         </w:tc>
       </w:tr>
@@ -8595,28 +7788,12 @@
           <w:b/>
         </w:rPr>
       </w:pPr>
-      <w:proofErr w:type="spellStart"/>
       <w:r>
         <w:rPr>
           <w:rFonts w:eastAsiaTheme="minorHAnsi" w:hint="eastAsia"/>
           <w:b/>
         </w:rPr>
-        <w:t>Ⅳ</w:t>
-      </w:r>
-      <w:proofErr w:type="spellEnd"/>
-      <w:r>
-        <w:rPr>
-          <w:rFonts w:eastAsiaTheme="minorHAnsi" w:hint="eastAsia"/>
-          <w:b/>
-        </w:rPr>
-        <w:t>. 기타 특이사항</w:t>
-      </w:r>
-      <w:r>
-        <w:rPr>
-          <w:rFonts w:eastAsiaTheme="minorHAnsi" w:hint="eastAsia"/>
-          <w:b/>
-        </w:rPr>
-        <w:t xml:space="preserve"> </w:t>
+        <w:t xml:space="preserve">Ⅳ. 기타 특이사항 </w:t>
       </w:r>
       <w:r>
         <w:rPr>
@@ -8835,27 +8012,7 @@
                       <w:kern w:val="0"/>
                       <w:szCs w:val="20"/>
                     </w:rPr>
-                    <w:t xml:space="preserve"> 상태, AO 신호, DO </w:t>
-                  </w:r>
-                  <w:proofErr w:type="gramStart"/>
-                  <w:r>
-                    <w:rPr>
-                      <w:rFonts w:eastAsiaTheme="minorHAnsi" w:cs="굴림"/>
-                      <w:color w:val="404040" w:themeColor="text1" w:themeTint="BF"/>
-                      <w:kern w:val="0"/>
-                      <w:szCs w:val="20"/>
-                    </w:rPr>
-                    <w:t>신호 :</w:t>
-                  </w:r>
-                  <w:proofErr w:type="gramEnd"/>
-                  <w:r>
-                    <w:rPr>
-                      <w:rFonts w:eastAsiaTheme="minorHAnsi" w:cs="굴림"/>
-                      <w:color w:val="404040" w:themeColor="text1" w:themeTint="BF"/>
-                      <w:kern w:val="0"/>
-                      <w:szCs w:val="20"/>
-                    </w:rPr>
-                    <w:t xml:space="preserve"> {{CPU_STATUS}}</w:t>
+                    <w:t xml:space="preserve"> 상태, AO 신호, DO 신호 : {{CPU_STATUS}}</w:t>
                   </w:r>
                 </w:p>
               </w:tc>
@@ -8877,7 +8034,6 @@
                       <w:szCs w:val="20"/>
                     </w:rPr>
                   </w:pPr>
-                  <w:proofErr w:type="spellStart"/>
                   <w:r>
                     <w:rPr>
                       <w:rFonts w:eastAsiaTheme="minorHAnsi" w:cs="굴림" w:hint="eastAsia"/>
@@ -8885,17 +8041,7 @@
                       <w:kern w:val="0"/>
                       <w:szCs w:val="20"/>
                     </w:rPr>
-                    <w:t>광학부품</w:t>
-                  </w:r>
-                  <w:proofErr w:type="spellEnd"/>
-                  <w:r>
-                    <w:rPr>
-                      <w:rFonts w:eastAsiaTheme="minorHAnsi" w:cs="굴림" w:hint="eastAsia"/>
-                      <w:color w:val="404040" w:themeColor="text1" w:themeTint="BF"/>
-                      <w:kern w:val="0"/>
-                      <w:szCs w:val="20"/>
-                    </w:rPr>
-                    <w:t xml:space="preserve"> </w:t>
+                    <w:t xml:space="preserve">광학부품 </w:t>
                   </w:r>
                   <w:r>
                     <w:rPr>
@@ -8976,27 +8122,7 @@
                       <w:kern w:val="0"/>
                       <w:szCs w:val="20"/>
                     </w:rPr>
-                    <w:t xml:space="preserve"> </w:t>
-                  </w:r>
-                  <w:proofErr w:type="gramStart"/>
-                  <w:r>
-                    <w:rPr>
-                      <w:rFonts w:eastAsiaTheme="minorHAnsi" w:cs="굴림"/>
-                      <w:color w:val="404040" w:themeColor="text1" w:themeTint="BF"/>
-                      <w:kern w:val="0"/>
-                      <w:szCs w:val="20"/>
-                    </w:rPr>
-                    <w:t>상태 :</w:t>
-                  </w:r>
-                  <w:proofErr w:type="gramEnd"/>
-                  <w:r>
-                    <w:rPr>
-                      <w:rFonts w:eastAsiaTheme="minorHAnsi" w:cs="굴림"/>
-                      <w:color w:val="404040" w:themeColor="text1" w:themeTint="BF"/>
-                      <w:kern w:val="0"/>
-                      <w:szCs w:val="20"/>
-                    </w:rPr>
-                    <w:t xml:space="preserve"> {{OPTICS_CONTAMINATION}}</w:t>
+                    <w:t xml:space="preserve"> 상태 : {{OPTICS_CONTAMINATION}}</w:t>
                   </w:r>
                 </w:p>
               </w:tc>
@@ -9018,7 +8144,6 @@
                       <w:szCs w:val="20"/>
                     </w:rPr>
                   </w:pPr>
-                  <w:proofErr w:type="spellStart"/>
                   <w:r>
                     <w:rPr>
                       <w:rFonts w:eastAsiaTheme="minorHAnsi" w:cs="굴림" w:hint="eastAsia"/>
@@ -9026,17 +8151,7 @@
                       <w:kern w:val="0"/>
                       <w:szCs w:val="20"/>
                     </w:rPr>
-                    <w:t>광학부품</w:t>
-                  </w:r>
-                  <w:proofErr w:type="spellEnd"/>
-                  <w:r>
-                    <w:rPr>
-                      <w:rFonts w:eastAsiaTheme="minorHAnsi" w:cs="굴림" w:hint="eastAsia"/>
-                      <w:color w:val="404040" w:themeColor="text1" w:themeTint="BF"/>
-                      <w:kern w:val="0"/>
-                      <w:szCs w:val="20"/>
-                    </w:rPr>
-                    <w:t xml:space="preserve"> </w:t>
+                    <w:t xml:space="preserve">광학부품 </w:t>
                   </w:r>
                   <w:r>
                     <w:rPr>
@@ -9110,27 +8225,7 @@
                       <w:kern w:val="0"/>
                       <w:szCs w:val="20"/>
                     </w:rPr>
-                    <w:t xml:space="preserve"> </w:t>
-                  </w:r>
-                  <w:proofErr w:type="gramStart"/>
-                  <w:r>
-                    <w:rPr>
-                      <w:rFonts w:eastAsiaTheme="minorHAnsi" w:cs="굴림"/>
-                      <w:color w:val="404040" w:themeColor="text1" w:themeTint="BF"/>
-                      <w:kern w:val="0"/>
-                      <w:szCs w:val="20"/>
-                    </w:rPr>
-                    <w:t>상태 :</w:t>
-                  </w:r>
-                  <w:proofErr w:type="gramEnd"/>
-                  <w:r>
-                    <w:rPr>
-                      <w:rFonts w:eastAsiaTheme="minorHAnsi" w:cs="굴림"/>
-                      <w:color w:val="404040" w:themeColor="text1" w:themeTint="BF"/>
-                      <w:kern w:val="0"/>
-                      <w:szCs w:val="20"/>
-                    </w:rPr>
-                    <w:t xml:space="preserve"> {{BEAMSPLITTER_CONTAMINATION}}</w:t>
+                    <w:t xml:space="preserve"> 상태 : {{BEAMSPLITTER_CONTAMINATION}}</w:t>
                   </w:r>
                 </w:p>
               </w:tc>
@@ -9207,17 +8302,7 @@
                       <w:kern w:val="0"/>
                       <w:szCs w:val="20"/>
                     </w:rPr>
-                    <w:t xml:space="preserve"> </w:t>
-                  </w:r>
-                  <w:proofErr w:type="gramStart"/>
-                  <w:r>
-                    <w:rPr>
-                      <w:rFonts w:eastAsiaTheme="minorHAnsi" w:cs="굴림" w:hint="eastAsia"/>
-                      <w:color w:val="404040" w:themeColor="text1" w:themeTint="BF"/>
-                      <w:kern w:val="0"/>
-                      <w:szCs w:val="20"/>
-                    </w:rPr>
-                    <w:t xml:space="preserve">용도 </w:t>
+                    <w:t xml:space="preserve"> 용도 </w:t>
                   </w:r>
                   <w:r>
                     <w:rPr>
@@ -9226,19 +8311,8 @@
                       <w:kern w:val="0"/>
                       <w:szCs w:val="20"/>
                     </w:rPr>
-                    <w:t>:</w:t>
+                    <w:t xml:space="preserve">: </w:t>
                   </w:r>
-                  <w:proofErr w:type="gramEnd"/>
-                  <w:r>
-                    <w:rPr>
-                      <w:rFonts w:eastAsiaTheme="minorHAnsi" w:cs="굴림"/>
-                      <w:color w:val="404040" w:themeColor="text1" w:themeTint="BF"/>
-                      <w:kern w:val="0"/>
-                      <w:szCs w:val="20"/>
-                    </w:rPr>
-                    <w:t xml:space="preserve"> </w:t>
-                  </w:r>
-                  <w:proofErr w:type="spellStart"/>
                   <w:r>
                     <w:rPr>
                       <w:rFonts w:eastAsiaTheme="minorHAnsi" w:cs="굴림" w:hint="eastAsia"/>
@@ -9246,17 +8320,7 @@
                       <w:kern w:val="0"/>
                       <w:szCs w:val="20"/>
                     </w:rPr>
-                    <w:t>프로브에서</w:t>
-                  </w:r>
-                  <w:proofErr w:type="spellEnd"/>
-                  <w:r>
-                    <w:rPr>
-                      <w:rFonts w:eastAsiaTheme="minorHAnsi" w:cs="굴림" w:hint="eastAsia"/>
-                      <w:color w:val="404040" w:themeColor="text1" w:themeTint="BF"/>
-                      <w:kern w:val="0"/>
-                      <w:szCs w:val="20"/>
-                    </w:rPr>
-                    <w:t xml:space="preserve"> 반사된 광원을 </w:t>
+                    <w:t xml:space="preserve">프로브에서 반사된 광원을 </w:t>
                   </w:r>
                   <w:r>
                     <w:rPr>
@@ -9266,27 +8330,7 @@
                       <w:sz w:val="18"/>
                       <w:szCs w:val="18"/>
                     </w:rPr>
-                    <w:t>분광기</w:t>
-                  </w:r>
-                  <w:r>
-                    <w:rPr>
-                      <w:rFonts w:eastAsiaTheme="minorHAnsi" w:cs="굴림" w:hint="eastAsia"/>
-                      <w:color w:val="404040" w:themeColor="text1" w:themeTint="BF"/>
-                      <w:kern w:val="0"/>
-                      <w:sz w:val="18"/>
-                      <w:szCs w:val="18"/>
-                    </w:rPr>
-                    <w:t xml:space="preserve"> </w:t>
-                  </w:r>
-                  <w:r>
-                    <w:rPr>
-                      <w:rFonts w:eastAsiaTheme="minorHAnsi" w:cs="굴림" w:hint="eastAsia"/>
-                      <w:color w:val="404040" w:themeColor="text1" w:themeTint="BF"/>
-                      <w:kern w:val="0"/>
-                      <w:sz w:val="18"/>
-                      <w:szCs w:val="18"/>
-                    </w:rPr>
-                    <w:t>(</w:t>
+                    <w:t>분광기 (</w:t>
                   </w:r>
                   <w:r>
                     <w:rPr>
@@ -9304,43 +8348,7 @@
                       <w:kern w:val="0"/>
                       <w:szCs w:val="20"/>
                     </w:rPr>
-                    <w:t>로</w:t>
-                  </w:r>
-                  <w:r>
-                    <w:rPr>
-                      <w:rFonts w:eastAsiaTheme="minorHAnsi" w:cs="굴림" w:hint="eastAsia"/>
-                      <w:color w:val="404040" w:themeColor="text1" w:themeTint="BF"/>
-                      <w:kern w:val="0"/>
-                      <w:szCs w:val="20"/>
-                    </w:rPr>
-                    <w:t xml:space="preserve"> </w:t>
-                  </w:r>
-                  <w:r>
-                    <w:rPr>
-                      <w:rFonts w:eastAsiaTheme="minorHAnsi" w:cs="굴림" w:hint="eastAsia"/>
-                      <w:color w:val="404040" w:themeColor="text1" w:themeTint="BF"/>
-                      <w:kern w:val="0"/>
-                      <w:szCs w:val="20"/>
-                    </w:rPr>
-                    <w:t>보내주는</w:t>
-                  </w:r>
-                  <w:r>
-                    <w:rPr>
-                      <w:rFonts w:eastAsiaTheme="minorHAnsi" w:cs="굴림" w:hint="eastAsia"/>
-                      <w:color w:val="404040" w:themeColor="text1" w:themeTint="BF"/>
-                      <w:kern w:val="0"/>
-                      <w:szCs w:val="20"/>
-                    </w:rPr>
-                    <w:t xml:space="preserve"> </w:t>
-                  </w:r>
-                  <w:r>
-                    <w:rPr>
-                      <w:rFonts w:eastAsiaTheme="minorHAnsi" w:cs="굴림" w:hint="eastAsia"/>
-                      <w:color w:val="404040" w:themeColor="text1" w:themeTint="BF"/>
-                      <w:kern w:val="0"/>
-                      <w:szCs w:val="20"/>
-                    </w:rPr>
-                    <w:t xml:space="preserve">렌즈 </w:t>
+                    <w:t xml:space="preserve">로 보내주는 렌즈 </w:t>
                   </w:r>
                 </w:p>
                 <w:p>
@@ -9364,7 +8372,6 @@
                     </w:rPr>
                     <w:t xml:space="preserve">2) </w:t>
                   </w:r>
-                  <w:proofErr w:type="gramStart"/>
                   <w:r>
                     <w:rPr>
                       <w:rFonts w:eastAsiaTheme="minorHAnsi" w:cs="굴림" w:hint="eastAsia"/>
@@ -9381,17 +8388,7 @@
                       <w:kern w:val="0"/>
                       <w:szCs w:val="20"/>
                     </w:rPr>
-                    <w:t>:</w:t>
-                  </w:r>
-                  <w:proofErr w:type="gramEnd"/>
-                  <w:r>
-                    <w:rPr>
-                      <w:rFonts w:eastAsiaTheme="minorHAnsi" w:cs="굴림"/>
-                      <w:color w:val="404040" w:themeColor="text1" w:themeTint="BF"/>
-                      <w:kern w:val="0"/>
-                      <w:szCs w:val="20"/>
-                    </w:rPr>
-                    <w:t xml:space="preserve"> </w:t>
+                    <w:t xml:space="preserve">: </w:t>
                   </w:r>
                   <w:r>
                     <w:rPr>
@@ -9498,7 +8495,6 @@
                       <w:szCs w:val="20"/>
                     </w:rPr>
                   </w:pPr>
-                  <w:proofErr w:type="gramStart"/>
                   <w:r>
                     <w:rPr>
                       <w:rFonts w:eastAsiaTheme="minorHAnsi" w:cs="굴림" w:hint="eastAsia"/>
@@ -9515,17 +8511,7 @@
                       <w:kern w:val="0"/>
                       <w:szCs w:val="20"/>
                     </w:rPr>
-                    <w:t xml:space="preserve"> :</w:t>
-                  </w:r>
-                  <w:proofErr w:type="gramEnd"/>
-                  <w:r>
-                    <w:rPr>
-                      <w:rFonts w:eastAsiaTheme="minorHAnsi" w:cs="굴림"/>
-                      <w:color w:val="404040" w:themeColor="text1" w:themeTint="BF"/>
-                      <w:kern w:val="0"/>
-                      <w:szCs w:val="20"/>
-                    </w:rPr>
-                    <w:t xml:space="preserve"> {{SPECTROMETER_STATUS}}</w:t>
+                    <w:t xml:space="preserve"> : {{SPECTROMETER_STATUS}}</w:t>
                   </w:r>
                 </w:p>
               </w:tc>
@@ -9577,17 +8563,7 @@
                       <w:kern w:val="0"/>
                       <w:szCs w:val="20"/>
                     </w:rPr>
-                    <w:t xml:space="preserve">1) </w:t>
-                  </w:r>
-                  <w:proofErr w:type="gramStart"/>
-                  <w:r>
-                    <w:rPr>
-                      <w:rFonts w:eastAsiaTheme="minorHAnsi" w:cs="굴림" w:hint="eastAsia"/>
-                      <w:color w:val="404040" w:themeColor="text1" w:themeTint="BF"/>
-                      <w:kern w:val="0"/>
-                      <w:szCs w:val="20"/>
-                    </w:rPr>
-                    <w:t xml:space="preserve">용도 </w:t>
+                    <w:t xml:space="preserve">1) 용도 </w:t>
                   </w:r>
                   <w:r>
                     <w:rPr>
@@ -9596,19 +8572,8 @@
                       <w:kern w:val="0"/>
                       <w:szCs w:val="20"/>
                     </w:rPr>
-                    <w:t>:</w:t>
+                    <w:t xml:space="preserve">: </w:t>
                   </w:r>
-                  <w:proofErr w:type="gramEnd"/>
-                  <w:r>
-                    <w:rPr>
-                      <w:rFonts w:eastAsiaTheme="minorHAnsi" w:cs="굴림"/>
-                      <w:color w:val="404040" w:themeColor="text1" w:themeTint="BF"/>
-                      <w:kern w:val="0"/>
-                      <w:szCs w:val="20"/>
-                    </w:rPr>
-                    <w:t xml:space="preserve"> </w:t>
-                  </w:r>
-                  <w:proofErr w:type="spellStart"/>
                   <w:r>
                     <w:rPr>
                       <w:rFonts w:eastAsiaTheme="minorHAnsi" w:cs="굴림" w:hint="eastAsia"/>
@@ -9616,37 +8581,7 @@
                       <w:kern w:val="0"/>
                       <w:szCs w:val="20"/>
                     </w:rPr>
-                    <w:t>프로브에서</w:t>
-                  </w:r>
-                  <w:proofErr w:type="spellEnd"/>
-                  <w:r>
-                    <w:rPr>
-                      <w:rFonts w:eastAsiaTheme="minorHAnsi" w:cs="굴림" w:hint="eastAsia"/>
-                      <w:color w:val="404040" w:themeColor="text1" w:themeTint="BF"/>
-                      <w:kern w:val="0"/>
-                      <w:szCs w:val="20"/>
-                    </w:rPr>
-                    <w:t xml:space="preserve"> 반사된 광원을 받아 빛의 </w:t>
-                  </w:r>
-                  <w:proofErr w:type="spellStart"/>
-                  <w:r>
-                    <w:rPr>
-                      <w:rFonts w:eastAsiaTheme="minorHAnsi" w:cs="굴림" w:hint="eastAsia"/>
-                      <w:color w:val="404040" w:themeColor="text1" w:themeTint="BF"/>
-                      <w:kern w:val="0"/>
-                      <w:szCs w:val="20"/>
-                    </w:rPr>
-                    <w:t>흡광된</w:t>
-                  </w:r>
-                  <w:proofErr w:type="spellEnd"/>
-                  <w:r>
-                    <w:rPr>
-                      <w:rFonts w:eastAsiaTheme="minorHAnsi" w:cs="굴림" w:hint="eastAsia"/>
-                      <w:color w:val="404040" w:themeColor="text1" w:themeTint="BF"/>
-                      <w:kern w:val="0"/>
-                      <w:szCs w:val="20"/>
-                    </w:rPr>
-                    <w:t xml:space="preserve"> 스펙트럼을 분석하여 </w:t>
+                    <w:t xml:space="preserve">프로브에서 반사된 광원을 받아 빛의 흡광된 스펙트럼을 분석하여 </w:t>
                   </w:r>
                   <w:r>
                     <w:rPr>
@@ -9664,16 +8599,7 @@
                       <w:kern w:val="0"/>
                       <w:szCs w:val="20"/>
                     </w:rPr>
-                    <w:t xml:space="preserve">에 </w:t>
-                  </w:r>
-                  <w:r>
-                    <w:rPr>
-                      <w:rFonts w:eastAsiaTheme="minorHAnsi" w:cs="굴림" w:hint="eastAsia"/>
-                      <w:color w:val="404040" w:themeColor="text1" w:themeTint="BF"/>
-                      <w:kern w:val="0"/>
-                      <w:szCs w:val="20"/>
-                    </w:rPr>
-                    <w:t>신호를 보내는 용도</w:t>
+                    <w:t>에 신호를 보내는 용도</w:t>
                   </w:r>
                 </w:p>
                 <w:p>
@@ -9695,17 +8621,7 @@
                       <w:kern w:val="0"/>
                       <w:szCs w:val="20"/>
                     </w:rPr>
-                    <w:t xml:space="preserve">2) </w:t>
-                  </w:r>
-                  <w:proofErr w:type="gramStart"/>
-                  <w:r>
-                    <w:rPr>
-                      <w:rFonts w:eastAsiaTheme="minorHAnsi" w:cs="굴림" w:hint="eastAsia"/>
-                      <w:color w:val="404040" w:themeColor="text1" w:themeTint="BF"/>
-                      <w:kern w:val="0"/>
-                      <w:szCs w:val="20"/>
-                    </w:rPr>
-                    <w:t>점검결과</w:t>
+                    <w:t>2) 점검결과</w:t>
                   </w:r>
                   <w:r>
                     <w:rPr>
@@ -9714,17 +8630,7 @@
                       <w:kern w:val="0"/>
                       <w:szCs w:val="20"/>
                     </w:rPr>
-                    <w:t xml:space="preserve"> :</w:t>
-                  </w:r>
-                  <w:proofErr w:type="gramEnd"/>
-                  <w:r>
-                    <w:rPr>
-                      <w:rFonts w:eastAsiaTheme="minorHAnsi" w:cs="굴림"/>
-                      <w:color w:val="404040" w:themeColor="text1" w:themeTint="BF"/>
-                      <w:kern w:val="0"/>
-                      <w:szCs w:val="20"/>
-                    </w:rPr>
-                    <w:t xml:space="preserve"> {{SPECTROMETER_COMMENT}}</w:t>
+                    <w:t xml:space="preserve"> : {{SPECTROMETER_COMMENT}}</w:t>
                   </w:r>
                 </w:p>
                 <w:p>
@@ -9878,27 +8784,7 @@
                       <w:kern w:val="0"/>
                       <w:szCs w:val="20"/>
                     </w:rPr>
-                    <w:t xml:space="preserve"> </w:t>
-                  </w:r>
-                  <w:proofErr w:type="gramStart"/>
-                  <w:r>
-                    <w:rPr>
-                      <w:rFonts w:eastAsiaTheme="minorHAnsi" w:cs="굴림"/>
-                      <w:color w:val="404040" w:themeColor="text1" w:themeTint="BF"/>
-                      <w:kern w:val="0"/>
-                      <w:szCs w:val="20"/>
-                    </w:rPr>
-                    <w:t>상태 :</w:t>
-                  </w:r>
-                  <w:proofErr w:type="gramEnd"/>
-                  <w:r>
-                    <w:rPr>
-                      <w:rFonts w:eastAsiaTheme="minorHAnsi" w:cs="굴림"/>
-                      <w:color w:val="404040" w:themeColor="text1" w:themeTint="BF"/>
-                      <w:kern w:val="0"/>
-                      <w:szCs w:val="20"/>
-                    </w:rPr>
-                    <w:t xml:space="preserve"> {{COOLINGFAN_STATUS}}</w:t>
+                    <w:t xml:space="preserve"> 상태 : {{COOLINGFAN_STATUS}}</w:t>
                   </w:r>
                 </w:p>
               </w:tc>
@@ -10046,38 +8932,7 @@
                       <w:kern w:val="0"/>
                       <w:szCs w:val="20"/>
                     </w:rPr>
-                    <w:t xml:space="preserve">, 단선, </w:t>
-                  </w:r>
-                  <w:proofErr w:type="spellStart"/>
-                  <w:proofErr w:type="gramStart"/>
-                  <w:r>
-                    <w:rPr>
-                      <w:rFonts w:eastAsiaTheme="minorHAnsi" w:cs="굴림"/>
-                      <w:color w:val="404040" w:themeColor="text1" w:themeTint="BF"/>
-                      <w:kern w:val="0"/>
-                      <w:szCs w:val="20"/>
-                    </w:rPr>
-                    <w:t>연결상태</w:t>
-                  </w:r>
-                  <w:proofErr w:type="spellEnd"/>
-                  <w:r>
-                    <w:rPr>
-                      <w:rFonts w:eastAsiaTheme="minorHAnsi" w:cs="굴림"/>
-                      <w:color w:val="404040" w:themeColor="text1" w:themeTint="BF"/>
-                      <w:kern w:val="0"/>
-                      <w:szCs w:val="20"/>
-                    </w:rPr>
-                    <w:t xml:space="preserve"> :</w:t>
-                  </w:r>
-                  <w:proofErr w:type="gramEnd"/>
-                  <w:r>
-                    <w:rPr>
-                      <w:rFonts w:eastAsiaTheme="minorHAnsi" w:cs="굴림"/>
-                      <w:color w:val="404040" w:themeColor="text1" w:themeTint="BF"/>
-                      <w:kern w:val="0"/>
-                      <w:szCs w:val="20"/>
-                    </w:rPr>
-                    <w:t xml:space="preserve"> {{WIRING_STATUS}}</w:t>
+                    <w:t>, 단선, 연결상태 : {{WIRING_STATUS}}</w:t>
                   </w:r>
                 </w:p>
               </w:tc>
@@ -10111,7 +8966,6 @@
                 <w:szCs w:val="20"/>
               </w:rPr>
             </w:pPr>
-            <w:proofErr w:type="spellStart"/>
             <w:r>
               <w:rPr>
                 <w:rFonts w:eastAsiaTheme="minorHAnsi" w:cs="굴림" w:hint="eastAsia"/>
@@ -10119,26 +8973,7 @@
                 <w:kern w:val="0"/>
                 <w:szCs w:val="20"/>
               </w:rPr>
-              <w:t>프로브</w:t>
-            </w:r>
-            <w:proofErr w:type="spellEnd"/>
-            <w:r>
-              <w:rPr>
-                <w:rFonts w:eastAsiaTheme="minorHAnsi" w:cs="굴림" w:hint="eastAsia"/>
-                <w:color w:val="404040" w:themeColor="text1" w:themeTint="BF"/>
-                <w:kern w:val="0"/>
-                <w:szCs w:val="20"/>
-              </w:rPr>
-              <w:t xml:space="preserve"> </w:t>
-            </w:r>
-            <w:r>
-              <w:rPr>
-                <w:rFonts w:eastAsiaTheme="minorHAnsi" w:cs="굴림" w:hint="eastAsia"/>
-                <w:color w:val="404040" w:themeColor="text1" w:themeTint="BF"/>
-                <w:kern w:val="0"/>
-                <w:szCs w:val="20"/>
-              </w:rPr>
-              <w:t>점검</w:t>
+              <w:t>프로브 점검</w:t>
             </w:r>
           </w:p>
           <w:tbl>
@@ -10336,7 +9171,6 @@
                       <w:szCs w:val="20"/>
                     </w:rPr>
                   </w:pPr>
-                  <w:proofErr w:type="spellStart"/>
                   <w:r>
                     <w:rPr>
                       <w:rFonts w:eastAsiaTheme="minorHAnsi" w:cs="굴림" w:hint="eastAsia"/>
@@ -10344,17 +9178,7 @@
                       <w:kern w:val="0"/>
                       <w:szCs w:val="20"/>
                     </w:rPr>
-                    <w:t>프로브</w:t>
-                  </w:r>
-                  <w:proofErr w:type="spellEnd"/>
-                  <w:r>
-                    <w:rPr>
-                      <w:rFonts w:eastAsiaTheme="minorHAnsi" w:cs="굴림" w:hint="eastAsia"/>
-                      <w:color w:val="404040" w:themeColor="text1" w:themeTint="BF"/>
-                      <w:kern w:val="0"/>
-                      <w:szCs w:val="20"/>
-                    </w:rPr>
-                    <w:t xml:space="preserve"> 길이</w:t>
+                    <w:t>프로브 길이</w:t>
                   </w:r>
                 </w:p>
               </w:tc>
@@ -10403,7 +9227,6 @@
                       <w:szCs w:val="20"/>
                     </w:rPr>
                   </w:pPr>
-                  <w:proofErr w:type="spellStart"/>
                   <w:r>
                     <w:rPr>
                       <w:rFonts w:eastAsiaTheme="minorHAnsi" w:cs="굴림" w:hint="eastAsia"/>
@@ -10413,7 +9236,6 @@
                     </w:rPr>
                     <w:t>측정구간</w:t>
                   </w:r>
-                  <w:proofErr w:type="spellEnd"/>
                 </w:p>
               </w:tc>
               <w:tc>
@@ -10461,7 +9283,6 @@
                       <w:szCs w:val="20"/>
                     </w:rPr>
                   </w:pPr>
-                  <w:proofErr w:type="spellStart"/>
                   <w:r>
                     <w:rPr>
                       <w:rFonts w:eastAsiaTheme="minorHAnsi" w:cs="굴림" w:hint="eastAsia"/>
@@ -10471,7 +9292,6 @@
                     </w:rPr>
                     <w:t>가스방향</w:t>
                   </w:r>
-                  <w:proofErr w:type="spellEnd"/>
                 </w:p>
               </w:tc>
               <w:tc>
@@ -10640,16 +9460,7 @@
                       <w:kern w:val="0"/>
                       <w:szCs w:val="20"/>
                     </w:rPr>
-                    <w:t>최종</w:t>
-                  </w:r>
-                  <w:r>
-                    <w:rPr>
-                      <w:rFonts w:eastAsiaTheme="minorHAnsi" w:cs="굴림" w:hint="eastAsia"/>
-                      <w:color w:val="404040" w:themeColor="text1" w:themeTint="BF"/>
-                      <w:kern w:val="0"/>
-                      <w:szCs w:val="20"/>
-                    </w:rPr>
-                    <w:t xml:space="preserve"> 점검</w:t>
+                    <w:t>최종 점검</w:t>
                   </w:r>
                   <w:r>
                     <w:rPr>
@@ -10754,27 +9565,7 @@
                       <w:kern w:val="0"/>
                       <w:szCs w:val="20"/>
                     </w:rPr>
-                    <w:t xml:space="preserve">분광기 </w:t>
-                  </w:r>
-                  <w:proofErr w:type="spellStart"/>
-                  <w:r>
-                    <w:rPr>
-                      <w:rFonts w:eastAsiaTheme="minorHAnsi" w:cs="굴림" w:hint="eastAsia"/>
-                      <w:color w:val="404040" w:themeColor="text1" w:themeTint="BF"/>
-                      <w:kern w:val="0"/>
-                      <w:szCs w:val="20"/>
-                    </w:rPr>
-                    <w:t>얼라인</w:t>
-                  </w:r>
-                  <w:proofErr w:type="spellEnd"/>
-                  <w:r>
-                    <w:rPr>
-                      <w:rFonts w:eastAsiaTheme="minorHAnsi" w:cs="굴림" w:hint="eastAsia"/>
-                      <w:color w:val="404040" w:themeColor="text1" w:themeTint="BF"/>
-                      <w:kern w:val="0"/>
-                      <w:szCs w:val="20"/>
-                    </w:rPr>
-                    <w:t xml:space="preserve"> 확인</w:t>
+                    <w:t>분광기 얼라인 확인</w:t>
                   </w:r>
                 </w:p>
               </w:tc>
@@ -10854,7 +9645,6 @@
                       <w:szCs w:val="20"/>
                     </w:rPr>
                   </w:pPr>
-                  <w:proofErr w:type="spellStart"/>
                   <w:r>
                     <w:rPr>
                       <w:rFonts w:eastAsiaTheme="minorHAnsi" w:cs="굴림" w:hint="eastAsia"/>
@@ -10862,37 +9652,7 @@
                       <w:kern w:val="0"/>
                       <w:szCs w:val="20"/>
                     </w:rPr>
-                    <w:t>프로브</w:t>
-                  </w:r>
-                  <w:proofErr w:type="spellEnd"/>
-                  <w:r>
-                    <w:rPr>
-                      <w:rFonts w:eastAsiaTheme="minorHAnsi" w:cs="굴림" w:hint="eastAsia"/>
-                      <w:color w:val="404040" w:themeColor="text1" w:themeTint="BF"/>
-                      <w:kern w:val="0"/>
-                      <w:szCs w:val="20"/>
-                    </w:rPr>
-                    <w:t xml:space="preserve"> </w:t>
-                  </w:r>
-                  <w:proofErr w:type="spellStart"/>
-                  <w:r>
-                    <w:rPr>
-                      <w:rFonts w:eastAsiaTheme="minorHAnsi" w:cs="굴림" w:hint="eastAsia"/>
-                      <w:color w:val="404040" w:themeColor="text1" w:themeTint="BF"/>
-                      <w:kern w:val="0"/>
-                      <w:szCs w:val="20"/>
-                    </w:rPr>
-                    <w:t>얼라인먼트</w:t>
-                  </w:r>
-                  <w:proofErr w:type="spellEnd"/>
-                  <w:r>
-                    <w:rPr>
-                      <w:rFonts w:eastAsiaTheme="minorHAnsi" w:cs="굴림" w:hint="eastAsia"/>
-                      <w:color w:val="404040" w:themeColor="text1" w:themeTint="BF"/>
-                      <w:kern w:val="0"/>
-                      <w:szCs w:val="20"/>
-                    </w:rPr>
-                    <w:t xml:space="preserve"> 확인</w:t>
+                    <w:t>프로브 얼라인먼트 확인</w:t>
                   </w:r>
                 </w:p>
               </w:tc>
@@ -10972,7 +9732,6 @@
                       <w:szCs w:val="20"/>
                     </w:rPr>
                   </w:pPr>
-                  <w:proofErr w:type="spellStart"/>
                   <w:r>
                     <w:rPr>
                       <w:rFonts w:eastAsiaTheme="minorHAnsi" w:cs="굴림" w:hint="eastAsia"/>
@@ -10980,17 +9739,7 @@
                       <w:kern w:val="0"/>
                       <w:szCs w:val="20"/>
                     </w:rPr>
-                    <w:t>표준가스</w:t>
-                  </w:r>
-                  <w:proofErr w:type="spellEnd"/>
-                  <w:r>
-                    <w:rPr>
-                      <w:rFonts w:eastAsiaTheme="minorHAnsi" w:cs="굴림" w:hint="eastAsia"/>
-                      <w:color w:val="404040" w:themeColor="text1" w:themeTint="BF"/>
-                      <w:kern w:val="0"/>
-                      <w:szCs w:val="20"/>
-                    </w:rPr>
-                    <w:t xml:space="preserve"> 교정</w:t>
+                    <w:t>표준가스 교정</w:t>
                   </w:r>
                 </w:p>
               </w:tc>
@@ -11091,25 +9840,7 @@
                 <w:sz w:val="22"/>
                 <w:szCs w:val="22"/>
               </w:rPr>
-              <w:t>교체</w:t>
-            </w:r>
-            <w:r>
-              <w:rPr>
-                <w:rFonts w:asciiTheme="minorHAnsi" w:eastAsiaTheme="minorHAnsi" w:hAnsiTheme="minorHAnsi" w:hint="eastAsia"/>
-                <w:b/>
-                <w:sz w:val="22"/>
-                <w:szCs w:val="22"/>
-              </w:rPr>
-              <w:t xml:space="preserve"> </w:t>
-            </w:r>
-            <w:r>
-              <w:rPr>
-                <w:rFonts w:asciiTheme="minorHAnsi" w:eastAsiaTheme="minorHAnsi" w:hAnsiTheme="minorHAnsi" w:hint="eastAsia"/>
-                <w:b/>
-                <w:sz w:val="22"/>
-                <w:szCs w:val="22"/>
-              </w:rPr>
-              <w:t>부품 사진</w:t>
+              <w:t>교체 부품 사진</w:t>
             </w:r>
           </w:p>
         </w:tc>
@@ -11409,19 +10140,7 @@
         <w:rPr>
           <w:rFonts w:eastAsiaTheme="minorHAnsi"/>
         </w:rPr>
-        <w:t>{{#OPTICAL_PHOTOS</w:t>
-      </w:r>
-      <w:r>
-        <w:rPr>
-          <w:rFonts w:eastAsiaTheme="minorHAnsi"/>
-        </w:rPr>
-        <w:t>_ROWS</w:t>
-      </w:r>
-      <w:r>
-        <w:rPr>
-          <w:rFonts w:eastAsiaTheme="minorHAnsi"/>
-        </w:rPr>
-        <w:t>}}</w:t>
+        <w:t>{{#OPTICAL_PHOTOS_ROWS}}</w:t>
       </w:r>
     </w:p>
     <w:tbl>
@@ -11568,19 +10287,7 @@
         <w:rPr>
           <w:rFonts w:asciiTheme="minorHAnsi" w:eastAsiaTheme="minorHAnsi" w:hAnsiTheme="minorHAnsi"/>
         </w:rPr>
-        <w:t>{{/OPTICAL_PHOTOS</w:t>
-      </w:r>
-      <w:r>
-        <w:rPr>
-          <w:rFonts w:asciiTheme="minorHAnsi" w:eastAsiaTheme="minorHAnsi" w:hAnsiTheme="minorHAnsi"/>
-        </w:rPr>
-        <w:t>_ROWS</w:t>
-      </w:r>
-      <w:r>
-        <w:rPr>
-          <w:rFonts w:asciiTheme="minorHAnsi" w:eastAsiaTheme="minorHAnsi" w:hAnsiTheme="minorHAnsi"/>
-        </w:rPr>
-        <w:t>}}</w:t>
+        <w:t>{{/OPTICAL_PHOTOS_ROWS}}</w:t>
       </w:r>
     </w:p>
     <w:p>
@@ -11665,34 +10372,7 @@
                 <w:color w:val="404040" w:themeColor="text1" w:themeTint="BF"/>
                 <w:sz w:val="22"/>
               </w:rPr>
-              <w:t>기타</w:t>
-            </w:r>
-            <w:r>
-              <w:rPr>
-                <w:rFonts w:eastAsiaTheme="minorHAnsi" w:hint="eastAsia"/>
-                <w:b/>
-                <w:color w:val="404040" w:themeColor="text1" w:themeTint="BF"/>
-                <w:sz w:val="22"/>
-              </w:rPr>
-              <w:t xml:space="preserve"> </w:t>
-            </w:r>
-            <w:r>
-              <w:rPr>
-                <w:rFonts w:eastAsiaTheme="minorHAnsi" w:hint="eastAsia"/>
-                <w:b/>
-                <w:color w:val="404040" w:themeColor="text1" w:themeTint="BF"/>
-                <w:sz w:val="22"/>
-              </w:rPr>
-              <w:t>부품</w:t>
-            </w:r>
-            <w:r>
-              <w:rPr>
-                <w:rFonts w:eastAsiaTheme="minorHAnsi" w:hint="eastAsia"/>
-                <w:b/>
-                <w:color w:val="404040" w:themeColor="text1" w:themeTint="BF"/>
-                <w:sz w:val="22"/>
-              </w:rPr>
-              <w:t xml:space="preserve"> </w:t>
+              <w:t xml:space="preserve">기타 부품 </w:t>
             </w:r>
             <w:r>
               <w:rPr>
@@ -11700,23 +10380,7 @@
                 <w:b/>
                 <w:sz w:val="22"/>
               </w:rPr>
-              <w:t>점검</w:t>
-            </w:r>
-            <w:r>
-              <w:rPr>
-                <w:rFonts w:eastAsiaTheme="minorHAnsi" w:hint="eastAsia"/>
-                <w:b/>
-                <w:sz w:val="22"/>
-              </w:rPr>
-              <w:t xml:space="preserve"> </w:t>
-            </w:r>
-            <w:r>
-              <w:rPr>
-                <w:rFonts w:eastAsiaTheme="minorHAnsi" w:hint="eastAsia"/>
-                <w:b/>
-                <w:sz w:val="22"/>
-              </w:rPr>
-              <w:t>사진</w:t>
+              <w:t>점검 사진</w:t>
             </w:r>
           </w:p>
         </w:tc>
@@ -11733,19 +10397,7 @@
         <w:rPr>
           <w:rFonts w:asciiTheme="minorHAnsi" w:eastAsiaTheme="minorHAnsi" w:hAnsiTheme="minorHAnsi"/>
         </w:rPr>
-        <w:t>{{#ELECTRICAL_PHOTOS</w:t>
-      </w:r>
-      <w:r>
-        <w:rPr>
-          <w:rFonts w:asciiTheme="minorHAnsi" w:eastAsiaTheme="minorHAnsi" w:hAnsiTheme="minorHAnsi"/>
-        </w:rPr>
-        <w:t>_ROWS</w:t>
-      </w:r>
-      <w:r>
-        <w:rPr>
-          <w:rFonts w:asciiTheme="minorHAnsi" w:eastAsiaTheme="minorHAnsi" w:hAnsiTheme="minorHAnsi"/>
-        </w:rPr>
-        <w:t>}}</w:t>
+        <w:t>{{#ELECTRICAL_PHOTOS_ROWS}}</w:t>
       </w:r>
     </w:p>
     <w:tbl>
@@ -11893,19 +10545,7 @@
         <w:rPr>
           <w:rFonts w:asciiTheme="minorHAnsi" w:eastAsiaTheme="minorHAnsi" w:hAnsiTheme="minorHAnsi"/>
         </w:rPr>
-        <w:t>{{/ELECTRICAL_PHOTOS</w:t>
-      </w:r>
-      <w:r>
-        <w:rPr>
-          <w:rFonts w:asciiTheme="minorHAnsi" w:eastAsiaTheme="minorHAnsi" w:hAnsiTheme="minorHAnsi"/>
-        </w:rPr>
-        <w:t>_ROWS</w:t>
-      </w:r>
-      <w:r>
-        <w:rPr>
-          <w:rFonts w:asciiTheme="minorHAnsi" w:eastAsiaTheme="minorHAnsi" w:hAnsiTheme="minorHAnsi"/>
-        </w:rPr>
-        <w:t>}}</w:t>
+        <w:t>{{/ELECTRICAL_PHOTOS_ROWS}}</w:t>
       </w:r>
     </w:p>
     <w:p>
@@ -11956,7 +10596,6 @@
                 <w:szCs w:val="22"/>
               </w:rPr>
             </w:pPr>
-            <w:proofErr w:type="spellStart"/>
             <w:r>
               <w:rPr>
                 <w:rFonts w:eastAsiaTheme="minorHAnsi" w:hint="eastAsia"/>
@@ -11965,7 +10604,6 @@
               </w:rPr>
               <w:t>프로브</w:t>
             </w:r>
-            <w:proofErr w:type="spellEnd"/>
             <w:r>
               <w:rPr>
                 <w:rFonts w:eastAsiaTheme="minorHAnsi"/>
@@ -11980,23 +10618,7 @@
                 <w:b/>
                 <w:sz w:val="22"/>
               </w:rPr>
-              <w:t>점검</w:t>
-            </w:r>
-            <w:r>
-              <w:rPr>
-                <w:rFonts w:eastAsiaTheme="minorHAnsi" w:hint="eastAsia"/>
-                <w:b/>
-                <w:sz w:val="22"/>
-              </w:rPr>
-              <w:t xml:space="preserve"> </w:t>
-            </w:r>
-            <w:r>
-              <w:rPr>
-                <w:rFonts w:eastAsiaTheme="minorHAnsi" w:hint="eastAsia"/>
-                <w:b/>
-                <w:sz w:val="22"/>
-              </w:rPr>
-              <w:t>사진</w:t>
+              <w:t>점검 사진</w:t>
             </w:r>
           </w:p>
         </w:tc>
@@ -12013,19 +10635,7 @@
         <w:rPr>
           <w:rFonts w:asciiTheme="minorHAnsi" w:eastAsiaTheme="minorHAnsi" w:hAnsiTheme="minorHAnsi"/>
         </w:rPr>
-        <w:t>{{#PROBE_PHOTOS</w:t>
-      </w:r>
-      <w:r>
-        <w:rPr>
-          <w:rFonts w:asciiTheme="minorHAnsi" w:eastAsiaTheme="minorHAnsi" w:hAnsiTheme="minorHAnsi"/>
-        </w:rPr>
-        <w:t>_ROWS</w:t>
-      </w:r>
-      <w:r>
-        <w:rPr>
-          <w:rFonts w:asciiTheme="minorHAnsi" w:eastAsiaTheme="minorHAnsi" w:hAnsiTheme="minorHAnsi"/>
-        </w:rPr>
-        <w:t>}}</w:t>
+        <w:t>{{#PROBE_PHOTOS_ROWS}}</w:t>
       </w:r>
     </w:p>
     <w:tbl>
@@ -12172,19 +10782,7 @@
         <w:rPr>
           <w:rFonts w:asciiTheme="minorHAnsi" w:eastAsiaTheme="minorHAnsi" w:hAnsiTheme="minorHAnsi"/>
         </w:rPr>
-        <w:t>{{/PROBE_PHOTOS</w:t>
-      </w:r>
-      <w:r>
-        <w:rPr>
-          <w:rFonts w:asciiTheme="minorHAnsi" w:eastAsiaTheme="minorHAnsi" w:hAnsiTheme="minorHAnsi"/>
-        </w:rPr>
-        <w:t>_ROWS</w:t>
-      </w:r>
-      <w:r>
-        <w:rPr>
-          <w:rFonts w:asciiTheme="minorHAnsi" w:eastAsiaTheme="minorHAnsi" w:hAnsiTheme="minorHAnsi"/>
-        </w:rPr>
-        <w:t>}}</w:t>
+        <w:t>{{/PROBE_PHOTOS_ROWS}}</w:t>
       </w:r>
     </w:p>
     <w:p>
@@ -12250,19 +10848,7 @@
         <w:rPr>
           <w:rFonts w:asciiTheme="minorHAnsi" w:eastAsiaTheme="minorHAnsi" w:hAnsiTheme="minorHAnsi"/>
         </w:rPr>
-        <w:t>{{#OTHER_PHOTOS</w:t>
-      </w:r>
-      <w:r>
-        <w:rPr>
-          <w:rFonts w:asciiTheme="minorHAnsi" w:eastAsiaTheme="minorHAnsi" w:hAnsiTheme="minorHAnsi"/>
-        </w:rPr>
-        <w:t>_ROWS</w:t>
-      </w:r>
-      <w:r>
-        <w:rPr>
-          <w:rFonts w:asciiTheme="minorHAnsi" w:eastAsiaTheme="minorHAnsi" w:hAnsiTheme="minorHAnsi"/>
-        </w:rPr>
-        <w:t>}}</w:t>
+        <w:t>{{#OTHER_PHOTOS_ROWS}}</w:t>
       </w:r>
     </w:p>
     <w:tbl>
@@ -12408,19 +10994,7 @@
         <w:rPr>
           <w:rFonts w:asciiTheme="minorHAnsi" w:eastAsiaTheme="minorHAnsi" w:hAnsiTheme="minorHAnsi"/>
         </w:rPr>
-        <w:t>{{/OTHER_PHOTOS</w:t>
-      </w:r>
-      <w:r>
-        <w:rPr>
-          <w:rFonts w:asciiTheme="minorHAnsi" w:eastAsiaTheme="minorHAnsi" w:hAnsiTheme="minorHAnsi"/>
-        </w:rPr>
-        <w:t>_ROWS</w:t>
-      </w:r>
-      <w:r>
-        <w:rPr>
-          <w:rFonts w:asciiTheme="minorHAnsi" w:eastAsiaTheme="minorHAnsi" w:hAnsiTheme="minorHAnsi"/>
-        </w:rPr>
-        <w:t>}}</w:t>
+        <w:t>{{/OTHER_PHOTOS_ROWS}}</w:t>
       </w:r>
     </w:p>
     <w:p>

</xml_diff>

<commit_message>
Adjusted Word template spacing
Co-authored-by: optenvex2023-beep <267874404+optenvex2023-beep@users.noreply.github.com>
</commit_message>
<xml_diff>
--- a/public/templates/final-report-template.docx
+++ b/public/templates/final-report-template.docx
@@ -240,7 +240,7 @@
     </w:p>
     <w:p>
       <w:pPr>
-        <w:spacing w:line="240" w:lineRule="auto"/>
+        <w:spacing w:before="600" w:line="240" w:lineRule="auto"/>
         <w:jc w:val="center"/>
         <w:rPr>
           <w:rFonts w:eastAsiaTheme="minorHAnsi"/>
@@ -863,7 +863,7 @@
     <w:tbl>
       <w:tblPr>
         <w:tblStyle w:val="a7"/>
-        <w:tblpPr w:leftFromText="142" w:rightFromText="142" w:vertAnchor="text" w:horzAnchor="margin" w:tblpXSpec="center" w:tblpY="100"/>
+        <w:tblpPr w:leftFromText="142" w:rightFromText="142" w:vertAnchor="text" w:horzAnchor="margin" w:tblpXSpec="center" w:tblpY="400"/>
         <w:tblW w:w="0" w:type="auto"/>
         <w:tblLook w:val="04A0" w:firstRow="1" w:lastRow="0" w:firstColumn="1" w:lastColumn="0" w:noHBand="0" w:noVBand="1"/>
       </w:tblPr>

</xml_diff>

<commit_message>
Tuned report template spacing
Co-authored-by: optenvex2023-beep <267874404+optenvex2023-beep@users.noreply.github.com>
</commit_message>
<xml_diff>
--- a/public/templates/final-report-template.docx
+++ b/public/templates/final-report-template.docx
@@ -240,7 +240,7 @@
     </w:p>
     <w:p>
       <w:pPr>
-        <w:spacing w:before="600" w:line="240" w:lineRule="auto"/>
+        <w:spacing w:before="1200" w:line="240" w:lineRule="auto"/>
         <w:jc w:val="center"/>
         <w:rPr>
           <w:rFonts w:eastAsiaTheme="minorHAnsi"/>
@@ -482,13 +482,14 @@
           <w:bottom w:w="15" w:type="dxa"/>
           <w:right w:w="15" w:type="dxa"/>
         </w:tblCellMar>
+        <w:jc w:val="center"/>
         <w:tblLook w:val="04A0" w:firstRow="1" w:lastRow="0" w:firstColumn="1" w:lastColumn="0" w:noHBand="0" w:noVBand="1"/>
       </w:tblPr>
       <w:tblGrid>
-        <w:gridCol w:w="2148"/>
-        <w:gridCol w:w="2181"/>
-        <w:gridCol w:w="2402"/>
-        <w:gridCol w:w="2289"/>
+        <w:gridCol w:w="1720"/>
+        <w:gridCol w:w="1745"/>
+        <w:gridCol w:w="1920"/>
+        <w:gridCol w:w="1984"/>
       </w:tblGrid>
       <w:tr>
         <w:trPr>
@@ -849,7 +850,7 @@
     </w:p>
     <w:p>
       <w:pPr>
-        <w:spacing w:before="200" w:after="0"/>
+        <w:spacing w:before="500" w:after="0"/>
         <w:pStyle w:val="a6"/>
         <w:wordWrap/>
         <w:rPr>

</xml_diff>

<commit_message>
Centered client table and tightened spacing
Co-authored-by: optenvex2023-beep <267874404+optenvex2023-beep@users.noreply.github.com>
</commit_message>
<xml_diff>
--- a/public/templates/final-report-template.docx
+++ b/public/templates/final-report-template.docx
@@ -865,6 +865,7 @@
       <w:tblPr>
         <w:tblStyle w:val="a7"/>
         <w:tblW w:w="0" w:type="auto"/>
+        <w:jc w:val="center"/>
         <w:tblLook w:val="04A0" w:firstRow="1" w:lastRow="0" w:firstColumn="1" w:lastColumn="0" w:noHBand="0" w:noVBand="1"/>
       </w:tblPr>
       <w:tblGrid>
@@ -1366,6 +1367,7 @@
           </w:tcPr>
           <w:p>
             <w:pPr>
+              <w:spacing w:before="0" w:after="0" w:line="200" w:lineRule="auto"/>
               <w:jc w:val="left"/>
               <w:textAlignment w:val="baseline"/>
             </w:pPr>
@@ -1417,6 +1419,7 @@
           </w:p>
           <w:p>
             <w:pPr>
+              <w:spacing w:before="0" w:after="0" w:line="200" w:lineRule="auto"/>
               <w:jc w:val="left"/>
               <w:textAlignment w:val="baseline"/>
             </w:pPr>
@@ -1468,6 +1471,7 @@
           </w:p>
           <w:p>
             <w:pPr>
+              <w:spacing w:before="0" w:after="0" w:line="200" w:lineRule="auto"/>
               <w:jc w:val="left"/>
               <w:textAlignment w:val="baseline"/>
             </w:pPr>
@@ -1519,6 +1523,7 @@
           </w:p>
           <w:p>
             <w:pPr>
+              <w:spacing w:before="0" w:after="0" w:line="200" w:lineRule="auto"/>
               <w:jc w:val="left"/>
               <w:textAlignment w:val="baseline"/>
             </w:pPr>
@@ -1570,6 +1575,7 @@
           </w:p>
           <w:p>
             <w:pPr>
+              <w:spacing w:before="0" w:after="0" w:line="200" w:lineRule="auto"/>
               <w:jc w:val="left"/>
               <w:textAlignment w:val="baseline"/>
             </w:pPr>
@@ -1621,6 +1627,7 @@
           </w:p>
           <w:p>
             <w:pPr>
+              <w:spacing w:before="0" w:after="0" w:line="200" w:lineRule="auto"/>
               <w:jc w:val="left"/>
               <w:textAlignment w:val="baseline"/>
             </w:pPr>
@@ -1672,6 +1679,7 @@
           </w:p>
           <w:p>
             <w:pPr>
+              <w:spacing w:before="0" w:after="0" w:line="200" w:lineRule="auto"/>
               <w:jc w:val="left"/>
               <w:textAlignment w:val="baseline"/>
             </w:pPr>
@@ -1723,6 +1731,7 @@
           </w:p>
           <w:p>
             <w:pPr>
+              <w:spacing w:before="0" w:after="0" w:line="200" w:lineRule="auto"/>
               <w:jc w:val="left"/>
               <w:textAlignment w:val="baseline"/>
             </w:pPr>
@@ -1774,6 +1783,7 @@
           </w:p>
           <w:p>
             <w:pPr>
+              <w:spacing w:before="0" w:after="0" w:line="200" w:lineRule="auto"/>
               <w:jc w:val="left"/>
               <w:textAlignment w:val="baseline"/>
             </w:pPr>
@@ -1859,6 +1869,7 @@
           </w:tcPr>
           <w:p>
             <w:pPr>
+              <w:spacing w:before="0" w:after="0" w:line="200" w:lineRule="auto"/>
               <w:jc w:val="left"/>
               <w:textAlignment w:val="baseline"/>
               <w:rPr>
@@ -1916,6 +1927,7 @@
           </w:p>
           <w:p>
             <w:pPr>
+              <w:spacing w:before="0" w:after="0" w:line="200" w:lineRule="auto"/>
               <w:jc w:val="left"/>
               <w:textAlignment w:val="baseline"/>
               <w:rPr>
@@ -1973,6 +1985,7 @@
           </w:p>
           <w:p>
             <w:pPr>
+              <w:spacing w:before="0" w:after="0" w:line="200" w:lineRule="auto"/>
               <w:jc w:val="left"/>
               <w:textAlignment w:val="baseline"/>
               <w:rPr>
@@ -2030,6 +2043,7 @@
           </w:p>
           <w:p>
             <w:pPr>
+              <w:spacing w:before="0" w:after="0" w:line="200" w:lineRule="auto"/>
               <w:jc w:val="left"/>
               <w:textAlignment w:val="baseline"/>
               <w:rPr>
@@ -2088,6 +2102,7 @@
           <w:p>
             <w:pPr>
               <w:wordWrap/>
+              <w:spacing w:before="0" w:after="0" w:line="200" w:lineRule="auto"/>
               <w:jc w:val="left"/>
               <w:textAlignment w:val="baseline"/>
               <w:rPr>
@@ -2285,6 +2300,7 @@
           <w:p>
             <w:pPr>
               <w:wordWrap/>
+              <w:spacing w:before="0" w:after="0" w:line="200" w:lineRule="auto"/>
               <w:jc w:val="left"/>
               <w:textAlignment w:val="baseline"/>
               <w:rPr>
@@ -2343,6 +2359,7 @@
           <w:p>
             <w:pPr>
               <w:wordWrap/>
+              <w:spacing w:before="0" w:after="0" w:line="200" w:lineRule="auto"/>
               <w:jc w:val="left"/>
               <w:textAlignment w:val="baseline"/>
               <w:rPr>
@@ -2401,6 +2418,7 @@
           <w:p>
             <w:pPr>
               <w:wordWrap/>
+              <w:spacing w:before="0" w:after="0" w:line="200" w:lineRule="auto"/>
               <w:jc w:val="left"/>
               <w:textAlignment w:val="baseline"/>
               <w:rPr>
@@ -2465,6 +2483,7 @@
           </w:tcPr>
           <w:p>
             <w:pPr>
+              <w:spacing w:before="0" w:after="0" w:line="200" w:lineRule="auto"/>
               <w:jc w:val="left"/>
               <w:textAlignment w:val="baseline"/>
               <w:rPr>
@@ -2506,6 +2525,7 @@
           </w:p>
           <w:p>
             <w:pPr>
+              <w:spacing w:before="0" w:after="0" w:line="200" w:lineRule="auto"/>
               <w:jc w:val="left"/>
               <w:textAlignment w:val="baseline"/>
               <w:rPr>
@@ -2536,6 +2556,7 @@
             <w:pPr>
               <w:wordWrap/>
               <w:spacing w:line="276" w:lineRule="auto"/>
+              <w:spacing w:before="0" w:after="0" w:line="200" w:lineRule="auto"/>
               <w:jc w:val="left"/>
               <w:textAlignment w:val="baseline"/>
               <w:rPr>
@@ -2715,6 +2736,7 @@
           </w:tcPr>
           <w:p>
             <w:pPr>
+              <w:spacing w:before="0" w:after="0" w:line="200" w:lineRule="auto"/>
               <w:jc w:val="left"/>
               <w:textAlignment w:val="baseline"/>
             </w:pPr>
@@ -2769,6 +2791,7 @@
           </w:p>
           <w:p>
             <w:pPr>
+              <w:spacing w:before="0" w:after="0" w:line="200" w:lineRule="auto"/>
               <w:jc w:val="left"/>
               <w:textAlignment w:val="baseline"/>
             </w:pPr>
@@ -2796,12 +2819,14 @@
           </w:p>
           <w:p>
             <w:pPr>
+              <w:spacing w:before="0" w:after="0" w:line="200" w:lineRule="auto"/>
               <w:jc w:val="left"/>
               <w:textAlignment w:val="baseline"/>
             </w:pPr>
           </w:p>
           <w:p>
             <w:pPr>
+              <w:spacing w:before="0" w:after="0" w:line="200" w:lineRule="auto"/>
               <w:jc w:val="left"/>
               <w:textAlignment w:val="baseline"/>
               <w:rPr>
@@ -2861,6 +2886,7 @@
           </w:p>
           <w:p>
             <w:pPr>
+              <w:spacing w:before="0" w:after="0" w:line="200" w:lineRule="auto"/>
               <w:jc w:val="left"/>
               <w:textAlignment w:val="baseline"/>
             </w:pPr>
@@ -2888,6 +2914,7 @@
           </w:p>
           <w:p>
             <w:pPr>
+              <w:spacing w:before="0" w:after="0" w:line="200" w:lineRule="auto"/>
               <w:jc w:val="left"/>
               <w:textAlignment w:val="baseline"/>
               <w:rPr>
@@ -2928,6 +2955,7 @@
           </w:tcPr>
           <w:p>
             <w:pPr>
+              <w:spacing w:before="0" w:after="0" w:line="200" w:lineRule="auto"/>
               <w:jc w:val="left"/>
               <w:textAlignment w:val="baseline"/>
               <w:rPr>
@@ -2940,6 +2968,7 @@
           </w:p>
           <w:p>
             <w:pPr>
+              <w:spacing w:before="0" w:after="0" w:line="200" w:lineRule="auto"/>
               <w:jc w:val="left"/>
               <w:textAlignment w:val="baseline"/>
               <w:rPr>
@@ -3033,6 +3062,7 @@
           </w:p>
           <w:p>
             <w:pPr>
+              <w:spacing w:before="0" w:after="0" w:line="200" w:lineRule="auto"/>
               <w:jc w:val="left"/>
               <w:textAlignment w:val="baseline"/>
               <w:rPr>
@@ -3045,6 +3075,7 @@
           </w:p>
           <w:p>
             <w:pPr>
+              <w:spacing w:before="0" w:after="0" w:line="200" w:lineRule="auto"/>
               <w:jc w:val="left"/>
               <w:textAlignment w:val="baseline"/>
               <w:rPr>
@@ -3138,6 +3169,7 @@
           </w:p>
           <w:p>
             <w:pPr>
+              <w:spacing w:before="0" w:after="0" w:line="200" w:lineRule="auto"/>
               <w:jc w:val="left"/>
               <w:textAlignment w:val="baseline"/>
               <w:rPr>
@@ -3150,6 +3182,7 @@
           </w:p>
           <w:p>
             <w:pPr>
+              <w:spacing w:before="0" w:after="0" w:line="200" w:lineRule="auto"/>
               <w:jc w:val="left"/>
               <w:textAlignment w:val="baseline"/>
               <w:rPr>
@@ -3243,6 +3276,7 @@
           </w:p>
           <w:p>
             <w:pPr>
+              <w:spacing w:before="0" w:after="0" w:line="200" w:lineRule="auto"/>
               <w:jc w:val="left"/>
               <w:textAlignment w:val="baseline"/>
               <w:rPr>
@@ -3255,6 +3289,7 @@
           </w:p>
           <w:p>
             <w:pPr>
+              <w:spacing w:before="0" w:after="0" w:line="200" w:lineRule="auto"/>
               <w:jc w:val="left"/>
               <w:textAlignment w:val="baseline"/>
               <w:rPr>
@@ -3349,6 +3384,7 @@
           </w:p>
           <w:p>
             <w:pPr>
+              <w:spacing w:before="0" w:after="0" w:line="200" w:lineRule="auto"/>
               <w:jc w:val="left"/>
               <w:textAlignment w:val="baseline"/>
               <w:rPr>
@@ -3361,6 +3397,7 @@
           </w:p>
           <w:p>
             <w:pPr>
+              <w:spacing w:before="0" w:after="0" w:line="200" w:lineRule="auto"/>
               <w:jc w:val="left"/>
               <w:textAlignment w:val="baseline"/>
               <w:rPr>
@@ -3425,6 +3462,7 @@
           <w:p>
             <w:pPr>
               <w:wordWrap/>
+              <w:spacing w:before="0" w:after="0" w:line="200" w:lineRule="auto"/>
               <w:jc w:val="left"/>
               <w:textAlignment w:val="baseline"/>
               <w:rPr>
@@ -3438,6 +3476,7 @@
           <w:p>
             <w:pPr>
               <w:wordWrap/>
+              <w:spacing w:before="0" w:after="0" w:line="200" w:lineRule="auto"/>
               <w:jc w:val="left"/>
               <w:textAlignment w:val="baseline"/>
               <w:rPr>
@@ -3532,6 +3571,7 @@
           <w:p>
             <w:pPr>
               <w:wordWrap/>
+              <w:spacing w:before="0" w:after="0" w:line="200" w:lineRule="auto"/>
               <w:jc w:val="left"/>
               <w:textAlignment w:val="baseline"/>
               <w:rPr>
@@ -3545,6 +3585,7 @@
           <w:p>
             <w:pPr>
               <w:wordWrap/>
+              <w:spacing w:before="0" w:after="0" w:line="200" w:lineRule="auto"/>
               <w:jc w:val="left"/>
               <w:textAlignment w:val="baseline"/>
               <w:rPr>
@@ -3639,6 +3680,7 @@
           <w:p>
             <w:pPr>
               <w:wordWrap/>
+              <w:spacing w:before="0" w:after="0" w:line="200" w:lineRule="auto"/>
               <w:jc w:val="left"/>
               <w:textAlignment w:val="baseline"/>
               <w:rPr>
@@ -3652,6 +3694,7 @@
           <w:p>
             <w:pPr>
               <w:wordWrap/>
+              <w:spacing w:before="0" w:after="0" w:line="200" w:lineRule="auto"/>
               <w:jc w:val="left"/>
               <w:textAlignment w:val="baseline"/>
               <w:rPr>
@@ -3710,6 +3753,7 @@
           <w:p>
             <w:pPr>
               <w:wordWrap/>
+              <w:spacing w:before="0" w:after="0" w:line="200" w:lineRule="auto"/>
               <w:jc w:val="left"/>
               <w:textAlignment w:val="baseline"/>
               <w:rPr>
@@ -3723,6 +3767,7 @@
           <w:p>
             <w:pPr>
               <w:wordWrap/>
+              <w:spacing w:before="0" w:after="0" w:line="200" w:lineRule="auto"/>
               <w:jc w:val="left"/>
               <w:textAlignment w:val="baseline"/>
               <w:rPr>
@@ -4091,6 +4136,7 @@
           </w:tcPr>
           <w:p>
             <w:pPr>
+              <w:spacing w:before="0" w:after="0" w:line="200" w:lineRule="auto"/>
               <w:jc w:val="left"/>
               <w:textAlignment w:val="baseline"/>
               <w:rPr>
@@ -4154,6 +4200,7 @@
           </w:p>
           <w:p>
             <w:pPr>
+              <w:spacing w:before="0" w:after="0" w:line="200" w:lineRule="auto"/>
               <w:jc w:val="left"/>
               <w:textAlignment w:val="baseline"/>
               <w:rPr>
@@ -4333,6 +4380,7 @@
           </w:tcPr>
           <w:p>
             <w:pPr>
+              <w:spacing w:before="0" w:after="0" w:line="200" w:lineRule="auto"/>
               <w:jc w:val="left"/>
               <w:textAlignment w:val="baseline"/>
               <w:rPr>
@@ -4390,6 +4438,7 @@
           </w:p>
           <w:p>
             <w:pPr>
+              <w:spacing w:before="0" w:after="0" w:line="200" w:lineRule="auto"/>
               <w:jc w:val="left"/>
               <w:textAlignment w:val="baseline"/>
               <w:rPr>
@@ -4564,6 +4613,7 @@
           </w:tcPr>
           <w:p>
             <w:pPr>
+              <w:spacing w:before="0" w:after="0" w:line="200" w:lineRule="auto"/>
               <w:jc w:val="left"/>
               <w:textAlignment w:val="baseline"/>
               <w:rPr>
@@ -4621,6 +4671,7 @@
           </w:p>
           <w:p>
             <w:pPr>
+              <w:spacing w:before="0" w:after="0" w:line="200" w:lineRule="auto"/>
               <w:jc w:val="left"/>
               <w:textAlignment w:val="baseline"/>
               <w:rPr>
@@ -4792,6 +4843,7 @@
           </w:tcPr>
           <w:p>
             <w:pPr>
+              <w:spacing w:before="0" w:after="0" w:line="200" w:lineRule="auto"/>
               <w:jc w:val="left"/>
               <w:textAlignment w:val="baseline"/>
               <w:rPr>
@@ -4850,6 +4902,7 @@
           </w:p>
           <w:p>
             <w:pPr>
+              <w:spacing w:before="0" w:after="0" w:line="200" w:lineRule="auto"/>
               <w:jc w:val="left"/>
               <w:textAlignment w:val="baseline"/>
               <w:rPr>
@@ -5010,6 +5063,7 @@
           </w:tcPr>
           <w:p>
             <w:pPr>
+              <w:spacing w:before="0" w:after="0" w:line="200" w:lineRule="auto"/>
               <w:jc w:val="left"/>
               <w:textAlignment w:val="baseline"/>
               <w:rPr>
@@ -5067,6 +5121,7 @@
           </w:p>
           <w:p>
             <w:pPr>
+              <w:spacing w:before="0" w:after="0" w:line="200" w:lineRule="auto"/>
               <w:jc w:val="left"/>
               <w:textAlignment w:val="baseline"/>
               <w:rPr>
@@ -5269,6 +5324,7 @@
           </w:tcPr>
           <w:p>
             <w:pPr>
+              <w:spacing w:before="0" w:after="0" w:line="200" w:lineRule="auto"/>
               <w:jc w:val="left"/>
               <w:textAlignment w:val="baseline"/>
               <w:rPr>
@@ -5326,6 +5382,7 @@
           </w:p>
           <w:p>
             <w:pPr>
+              <w:spacing w:before="0" w:after="0" w:line="200" w:lineRule="auto"/>
               <w:jc w:val="left"/>
               <w:textAlignment w:val="baseline"/>
               <w:rPr>
@@ -7932,6 +7989,7 @@
             <w:pPr>
               <w:wordWrap/>
               <w:spacing w:after="0" w:line="240" w:lineRule="auto"/>
+              <w:spacing w:before="0" w:after="0" w:line="200" w:lineRule="auto"/>
               <w:jc w:val="left"/>
               <w:textAlignment w:val="baseline"/>
               <w:rPr>
@@ -8942,6 +9000,7 @@
             <w:pPr>
               <w:wordWrap/>
               <w:spacing w:after="0" w:line="240" w:lineRule="auto"/>
+              <w:spacing w:before="0" w:after="0" w:line="200" w:lineRule="auto"/>
               <w:jc w:val="left"/>
               <w:textAlignment w:val="baseline"/>
               <w:rPr>
@@ -8957,6 +9016,7 @@
               <w:wordWrap/>
               <w:spacing w:after="0" w:line="240" w:lineRule="auto"/>
               <w:ind w:firstLineChars="50" w:firstLine="100"/>
+              <w:spacing w:before="0" w:after="0" w:line="200" w:lineRule="auto"/>
               <w:jc w:val="left"/>
               <w:textAlignment w:val="baseline"/>
               <w:rPr>
@@ -9327,6 +9387,7 @@
             <w:pPr>
               <w:wordWrap/>
               <w:spacing w:after="0" w:line="240" w:lineRule="auto"/>
+              <w:spacing w:before="0" w:after="0" w:line="200" w:lineRule="auto"/>
               <w:jc w:val="left"/>
               <w:textAlignment w:val="baseline"/>
               <w:rPr>
@@ -9341,6 +9402,7 @@
             <w:pPr>
               <w:wordWrap/>
               <w:spacing w:after="0" w:line="240" w:lineRule="auto"/>
+              <w:spacing w:before="0" w:after="0" w:line="200" w:lineRule="auto"/>
               <w:jc w:val="left"/>
               <w:textAlignment w:val="baseline"/>
               <w:rPr>
@@ -9355,6 +9417,7 @@
             <w:pPr>
               <w:wordWrap/>
               <w:spacing w:after="0" w:line="240" w:lineRule="auto"/>
+              <w:spacing w:before="0" w:after="0" w:line="200" w:lineRule="auto"/>
               <w:jc w:val="left"/>
               <w:textAlignment w:val="baseline"/>
               <w:rPr>
@@ -9777,6 +9840,7 @@
             <w:pPr>
               <w:wordWrap/>
               <w:spacing w:after="0" w:line="240" w:lineRule="auto"/>
+              <w:spacing w:before="0" w:after="0" w:line="200" w:lineRule="auto"/>
               <w:jc w:val="left"/>
               <w:textAlignment w:val="baseline"/>
               <w:rPr>

</xml_diff>

<commit_message>
Unify QA Signature Rendering
Co-authored-by: optenvex2023-beep <267874404+optenvex2023-beep@users.noreply.github.com>
</commit_message>
<xml_diff>
--- a/public/templates/final-report-template.docx
+++ b/public/templates/final-report-template.docx
@@ -810,7 +810,14 @@
               <w:bottom w:val="single" w:sz="2" w:space="0" w:color="000000"/>
               <w:right w:val="single" w:sz="2" w:space="0" w:color="000000"/>
             </w:tcBorders>
+            <w:tcMar>
+              <w:top w:w="28" w:type="dxa"/>
+              <w:left w:w="102" w:type="dxa"/>
+              <w:bottom w:w="28" w:type="dxa"/>
+              <w:right w:w="102" w:type="dxa"/>
+            </w:tcMar>
             <w:vAlign w:val="center"/>
+            <w:hideMark/>
           </w:tcPr>
           <w:p>
             <w:pPr>

</xml_diff>